<commit_message>
Update download filename; replace docx/pdf files
Point site download to the corrected guide file name (added '蚂蚁' in both file path and fileName in site-content.js). Replace the Word document binary and update/rename the generated PDF (removed the extra '.docx' from the PDF filename). Ensures the site serves the correct, renamed guide files.
</commit_message>
<xml_diff>
--- a/盈立复星众安蚂蚁平安开户指南.docx
+++ b/盈立复星众安蚂蚁平安开户指南.docx
@@ -3470,7 +3470,18 @@
           <w:szCs w:val="48"/>
           <w:lang w:val="en-US" w:eastAsia="zh-CN"/>
         </w:rPr>
-        <w:t>10月共返约800</w:t>
+        <w:t>10月共返约10</w:t>
+      </w:r>
+      <w:bookmarkStart w:id="0" w:name="_GoBack"/>
+      <w:bookmarkEnd w:id="0"/>
+      <w:r>
+        <w:rPr>
+          <w:rFonts w:hint="eastAsia"/>
+          <w:sz w:val="48"/>
+          <w:szCs w:val="48"/>
+          <w:lang w:val="en-US" w:eastAsia="zh-CN"/>
+        </w:rPr>
+        <w:t>00</w:t>
       </w:r>
       <w:r>
         <w:rPr>
@@ -3972,8 +3983,6 @@
         </w:rPr>
         <w:t>- 首页左下角【财富】——中间上方【资产】——右上方【查看邀请关系】——找到開戶邀請人和入資邀請人點更改</w:t>
       </w:r>
-      <w:bookmarkStart w:id="0" w:name="_GoBack"/>
-      <w:bookmarkEnd w:id="0"/>
     </w:p>
     <w:p>
       <w:pPr>

</xml_diff>

<commit_message>
Update site-content: add banks and refresh cards
Revise site-content.js: update subtitle (add highlighted invite-code warning), restructure the cards array to add ZA Bank and Macau Ant Bank, reorder/update existing entries (uSMART, Fotech/复星, 平安), add download links and register URLs, and include invite codes. Update related markdown/docs: rename several guide files, adjust campaign details (hold duration changed from 3 to 30 days, cashback updated e.g. 300→350 HKD, total benefit updated ~800→1000 HKD), add direct registration link in a 300HKD guide, and replace updated binary docx/pdf assets.
</commit_message>
<xml_diff>
--- a/盈立复星众安蚂蚁平安开户指南.docx
+++ b/盈立复星众安蚂蚁平安开户指南.docx
@@ -2004,20 +2004,29 @@
     <w:p>
       <w:pPr>
         <w:rPr>
-          <w:rFonts w:hint="eastAsia"/>
-          <w:sz w:val="48"/>
-          <w:szCs w:val="48"/>
-          <w:lang w:val="en-US" w:eastAsia="zh-CN"/>
-        </w:rPr>
-      </w:pPr>
-      <w:r>
-        <w:rPr>
-          <w:rFonts w:hint="eastAsia"/>
-          <w:sz w:val="48"/>
-          <w:szCs w:val="48"/>
-          <w:lang w:val="en-US" w:eastAsia="zh-CN"/>
-        </w:rPr>
-        <w:t>盈立证券新加坡</w:t>
+          <w:rFonts w:hint="default"/>
+          <w:sz w:val="18"/>
+          <w:szCs w:val="18"/>
+          <w:lang w:val="en-US" w:eastAsia="zh-CN"/>
+        </w:rPr>
+      </w:pPr>
+      <w:r>
+        <w:rPr>
+          <w:rFonts w:hint="eastAsia"/>
+          <w:sz w:val="48"/>
+          <w:szCs w:val="48"/>
+          <w:lang w:val="en-US" w:eastAsia="zh-CN"/>
+        </w:rPr>
+        <w:t xml:space="preserve">盈立证券新加坡 </w:t>
+      </w:r>
+      <w:r>
+        <w:rPr>
+          <w:rFonts w:hint="eastAsia"/>
+          <w:sz w:val="18"/>
+          <w:szCs w:val="18"/>
+          <w:lang w:val="en-US" w:eastAsia="zh-CN"/>
+        </w:rPr>
+        <w:t>2026.10更新</w:t>
       </w:r>
     </w:p>
     <w:p>
@@ -2328,20 +2337,29 @@
     <w:p>
       <w:pPr>
         <w:rPr>
-          <w:rFonts w:hint="eastAsia"/>
-          <w:sz w:val="48"/>
-          <w:szCs w:val="48"/>
-          <w:lang w:val="en-US" w:eastAsia="zh-CN"/>
-        </w:rPr>
-      </w:pPr>
-      <w:r>
-        <w:rPr>
-          <w:rFonts w:hint="eastAsia"/>
-          <w:sz w:val="48"/>
-          <w:szCs w:val="48"/>
-          <w:lang w:val="en-US" w:eastAsia="zh-CN"/>
-        </w:rPr>
-        <w:t>复星证券（星财富）</w:t>
+          <w:rFonts w:hint="default"/>
+          <w:sz w:val="15"/>
+          <w:szCs w:val="15"/>
+          <w:lang w:val="en-US" w:eastAsia="zh-CN"/>
+        </w:rPr>
+      </w:pPr>
+      <w:r>
+        <w:rPr>
+          <w:rFonts w:hint="eastAsia"/>
+          <w:sz w:val="48"/>
+          <w:szCs w:val="48"/>
+          <w:lang w:val="en-US" w:eastAsia="zh-CN"/>
+        </w:rPr>
+        <w:t xml:space="preserve">复星证券（星财富） </w:t>
+      </w:r>
+      <w:r>
+        <w:rPr>
+          <w:rFonts w:hint="eastAsia"/>
+          <w:sz w:val="24"/>
+          <w:szCs w:val="24"/>
+          <w:lang w:val="en-US" w:eastAsia="zh-CN"/>
+        </w:rPr>
+        <w:t>2026.10月更新</w:t>
       </w:r>
     </w:p>
     <w:p>
@@ -2407,7 +2425,17 @@
           <w:szCs w:val="48"/>
           <w:lang w:val="en-US" w:eastAsia="zh-CN"/>
         </w:rPr>
-        <w:t>填邀请码注册活动：注册一个月内首次入金≥10,000港币（或等值美刀）连续持有三天过夜</w:t>
+        <w:t>填邀请码注册活动：注册一个月内首次入金≥10,000港币（或等值美刀）</w:t>
+      </w:r>
+      <w:r>
+        <w:rPr>
+          <w:rFonts w:hint="eastAsia"/>
+          <w:color w:val="FF0000"/>
+          <w:sz w:val="48"/>
+          <w:szCs w:val="48"/>
+          <w:lang w:val="en-US" w:eastAsia="zh-CN"/>
+        </w:rPr>
+        <w:t>连续持有30天过夜</w:t>
       </w:r>
     </w:p>
     <w:p>
@@ -2859,7 +2887,7 @@
     <w:p>
       <w:pPr>
         <w:rPr>
-          <w:rFonts w:hint="eastAsia"/>
+          <w:rFonts w:hint="default"/>
           <w:sz w:val="48"/>
           <w:szCs w:val="48"/>
           <w:lang w:val="en-US" w:eastAsia="zh-CN"/>
@@ -2873,6 +2901,15 @@
           <w:lang w:val="en-US" w:eastAsia="zh-CN"/>
         </w:rPr>
         <w:t xml:space="preserve">众安银行 </w:t>
+      </w:r>
+      <w:r>
+        <w:rPr>
+          <w:rFonts w:hint="eastAsia"/>
+          <w:sz w:val="21"/>
+          <w:szCs w:val="21"/>
+          <w:lang w:val="en-US" w:eastAsia="zh-CN"/>
+        </w:rPr>
+        <w:t>2026.10更新</w:t>
       </w:r>
     </w:p>
     <w:p>
@@ -3150,20 +3187,29 @@
     <w:p>
       <w:pPr>
         <w:rPr>
-          <w:rFonts w:hint="eastAsia"/>
-          <w:sz w:val="48"/>
-          <w:szCs w:val="48"/>
-          <w:lang w:val="en-US" w:eastAsia="zh-CN"/>
-        </w:rPr>
-      </w:pPr>
-      <w:r>
-        <w:rPr>
-          <w:rFonts w:hint="eastAsia"/>
-          <w:sz w:val="48"/>
-          <w:szCs w:val="48"/>
-          <w:lang w:val="en-US" w:eastAsia="zh-CN"/>
-        </w:rPr>
-        <w:t>平安数字银行</w:t>
+          <w:rFonts w:hint="default"/>
+          <w:sz w:val="21"/>
+          <w:szCs w:val="21"/>
+          <w:lang w:val="en-US" w:eastAsia="zh-CN"/>
+        </w:rPr>
+      </w:pPr>
+      <w:r>
+        <w:rPr>
+          <w:rFonts w:hint="eastAsia"/>
+          <w:sz w:val="48"/>
+          <w:szCs w:val="48"/>
+          <w:lang w:val="en-US" w:eastAsia="zh-CN"/>
+        </w:rPr>
+        <w:t xml:space="preserve">平安数字银行     </w:t>
+      </w:r>
+      <w:r>
+        <w:rPr>
+          <w:rFonts w:hint="eastAsia"/>
+          <w:sz w:val="21"/>
+          <w:szCs w:val="21"/>
+          <w:lang w:val="en-US" w:eastAsia="zh-CN"/>
+        </w:rPr>
+        <w:t>2026.10更新</w:t>
       </w:r>
     </w:p>
     <w:p>
@@ -3428,60 +3474,58 @@
     <w:p>
       <w:pPr>
         <w:rPr>
-          <w:rFonts w:hint="eastAsia"/>
-          <w:sz w:val="48"/>
-          <w:szCs w:val="48"/>
-          <w:lang w:val="en-US" w:eastAsia="zh-CN"/>
-        </w:rPr>
-      </w:pPr>
-      <w:r>
-        <w:rPr>
-          <w:rFonts w:hint="eastAsia"/>
-          <w:sz w:val="48"/>
-          <w:szCs w:val="48"/>
-          <w:lang w:val="en-US" w:eastAsia="zh-CN"/>
-        </w:rPr>
-        <w:t>澳门蚂蚁银行（Antbank Macau）</w:t>
-      </w:r>
-    </w:p>
-    <w:p>
-      <w:pPr>
-        <w:rPr>
-          <w:rFonts w:hint="eastAsia"/>
-          <w:sz w:val="48"/>
-          <w:szCs w:val="48"/>
-          <w:lang w:val="en-US" w:eastAsia="zh-CN"/>
-        </w:rPr>
-      </w:pPr>
-    </w:p>
-    <w:p>
-      <w:pPr>
-        <w:rPr>
-          <w:rFonts w:hint="default"/>
-          <w:sz w:val="48"/>
-          <w:szCs w:val="48"/>
-          <w:lang w:val="en-US" w:eastAsia="zh-CN"/>
-        </w:rPr>
-      </w:pPr>
-      <w:r>
-        <w:rPr>
-          <w:rFonts w:hint="eastAsia"/>
-          <w:sz w:val="48"/>
-          <w:szCs w:val="48"/>
-          <w:lang w:val="en-US" w:eastAsia="zh-CN"/>
-        </w:rPr>
-        <w:t>10月共返约10</w:t>
-      </w:r>
-      <w:bookmarkStart w:id="0" w:name="_GoBack"/>
-      <w:bookmarkEnd w:id="0"/>
-      <w:r>
-        <w:rPr>
-          <w:rFonts w:hint="eastAsia"/>
-          <w:sz w:val="48"/>
-          <w:szCs w:val="48"/>
-          <w:lang w:val="en-US" w:eastAsia="zh-CN"/>
-        </w:rPr>
-        <w:t>00</w:t>
+          <w:rFonts w:hint="default"/>
+          <w:sz w:val="21"/>
+          <w:szCs w:val="21"/>
+          <w:lang w:val="en-US" w:eastAsia="zh-CN"/>
+        </w:rPr>
+      </w:pPr>
+      <w:r>
+        <w:rPr>
+          <w:rFonts w:hint="eastAsia"/>
+          <w:sz w:val="48"/>
+          <w:szCs w:val="48"/>
+          <w:lang w:val="en-US" w:eastAsia="zh-CN"/>
+        </w:rPr>
+        <w:t xml:space="preserve">澳门蚂蚁银行（Antbank Macau） </w:t>
+      </w:r>
+      <w:r>
+        <w:rPr>
+          <w:rFonts w:hint="eastAsia"/>
+          <w:sz w:val="21"/>
+          <w:szCs w:val="21"/>
+          <w:lang w:val="en-US" w:eastAsia="zh-CN"/>
+        </w:rPr>
+        <w:t>2026.10更新</w:t>
+      </w:r>
+    </w:p>
+    <w:p>
+      <w:pPr>
+        <w:rPr>
+          <w:rFonts w:hint="eastAsia"/>
+          <w:sz w:val="48"/>
+          <w:szCs w:val="48"/>
+          <w:lang w:val="en-US" w:eastAsia="zh-CN"/>
+        </w:rPr>
+      </w:pPr>
+    </w:p>
+    <w:p>
+      <w:pPr>
+        <w:rPr>
+          <w:rFonts w:hint="default"/>
+          <w:sz w:val="48"/>
+          <w:szCs w:val="48"/>
+          <w:lang w:val="en-US" w:eastAsia="zh-CN"/>
+        </w:rPr>
+      </w:pPr>
+      <w:r>
+        <w:rPr>
+          <w:rFonts w:hint="eastAsia"/>
+          <w:sz w:val="48"/>
+          <w:szCs w:val="48"/>
+          <w:lang w:val="en-US" w:eastAsia="zh-CN"/>
+        </w:rPr>
+        <w:t>10月共返约1000</w:t>
       </w:r>
       <w:r>
         <w:rPr>
@@ -4564,6 +4608,8 @@
           <w:lang w:val="en-US" w:eastAsia="zh-CN"/>
         </w:rPr>
       </w:pPr>
+      <w:bookmarkStart w:id="0" w:name="_GoBack"/>
+      <w:bookmarkEnd w:id="0"/>
     </w:p>
     <w:p>
       <w:pPr>
@@ -4581,7 +4627,7 @@
           <w:szCs w:val="30"/>
           <w:lang w:val="en-US" w:eastAsia="zh-CN"/>
         </w:rPr>
-        <w:t>文档更新日期2026.9月，每个月活动可能都会变，建议看网站或者联系咨询我！谢谢</w:t>
+        <w:t>文档更新日期2026.10月，每个月活动可能都会变，建议看网站或者联系咨询我！谢谢</w:t>
       </w:r>
     </w:p>
     <w:sectPr>

</xml_diff>

<commit_message>
Add GigaMoney promo and update PAOB color
Add a new broker entry for 腾达证券 (GigaMoney) to site-content.js including tags, sections, invite code, register link and download/guide file. Add the corresponding markdown promotion file describing the Oct campaign and rewards. Also adjust PAOB card border color from #ffa726 to #ff0000 and update associated .docx/.pdf assets.
</commit_message>
<xml_diff>
--- a/盈立复星众安蚂蚁平安开户指南.docx
+++ b/盈立复星众安蚂蚁平安开户指南.docx
@@ -2,6 +2,738 @@
 <file path=word/document.xml><?xml version="1.0" encoding="utf-8"?>
 <w:document xmlns:wpc="http://schemas.microsoft.com/office/word/2010/wordprocessingCanvas" xmlns:cx="http://schemas.microsoft.com/office/drawing/2014/chartex" xmlns:cx1="http://schemas.microsoft.com/office/drawing/2015/9/8/chartex" xmlns:cx2="http://schemas.microsoft.com/office/drawing/2015/10/21/chartex" xmlns:cx3="http://schemas.microsoft.com/office/drawing/2016/5/9/chartex" xmlns:cx4="http://schemas.microsoft.com/office/drawing/2016/5/10/chartex" xmlns:cx5="http://schemas.microsoft.com/office/drawing/2016/5/11/chartex" xmlns:cx6="http://schemas.microsoft.com/office/drawing/2016/5/12/chartex" xmlns:cx7="http://schemas.microsoft.com/office/drawing/2016/5/13/chartex" xmlns:cx8="http://schemas.microsoft.com/office/drawing/2016/5/14/chartex" xmlns:mc="http://schemas.openxmlformats.org/markup-compatibility/2006" xmlns:o="urn:schemas-microsoft-com:office:office" xmlns:r="http://schemas.openxmlformats.org/officeDocument/2006/relationships" xmlns:m="http://schemas.openxmlformats.org/officeDocument/2006/math" xmlns:v="urn:schemas-microsoft-com:vml" xmlns:wp14="http://schemas.microsoft.com/office/word/2010/wordprocessingDrawing" xmlns:wp="http://schemas.openxmlformats.org/drawingml/2006/wordprocessingDrawing" xmlns:w="http://schemas.openxmlformats.org/wordprocessingml/2006/main" xmlns:w14="http://schemas.microsoft.com/office/word/2010/wordml" xmlns:w10="urn:schemas-microsoft-com:office:word" xmlns:w15="http://schemas.microsoft.com/office/word/2012/wordml" xmlns:wpg="http://schemas.microsoft.com/office/word/2010/wordprocessingGroup" xmlns:wpi="http://schemas.microsoft.com/office/word/2010/wordprocessingInk" xmlns:wne="http://schemas.microsoft.com/office/word/2006/wordml" xmlns:wps="http://schemas.microsoft.com/office/word/2010/wordprocessingShape" xmlns:wpsCustomData="http://www.wps.cn/officeDocument/2013/wpsCustomData" mc:Ignorable="w14 w15 wp14">
   <w:body>
+    <w:sdt>
+      <w:sdtPr>
+        <w:rPr>
+          <w:rFonts w:ascii="宋体" w:hAnsi="宋体" w:eastAsia="宋体" w:cstheme="minorBidi"/>
+          <w:kern w:val="2"/>
+          <w:sz w:val="21"/>
+          <w:szCs w:val="24"/>
+          <w:lang w:val="en-US" w:eastAsia="zh-CN" w:bidi="ar-SA"/>
+        </w:rPr>
+        <w:id w:val="147475012"/>
+        <w15:color w:val="DBDBDB"/>
+        <w:docPartObj>
+          <w:docPartGallery w:val="Table of Contents"/>
+          <w:docPartUnique/>
+        </w:docPartObj>
+      </w:sdtPr>
+      <w:sdtEndPr>
+        <w:rPr>
+          <w:rFonts w:hint="eastAsia" w:ascii="宋体" w:hAnsi="宋体" w:eastAsia="宋体" w:cs="宋体"/>
+          <w:kern w:val="2"/>
+          <w:sz w:val="21"/>
+          <w:szCs w:val="24"/>
+          <w:lang w:val="en-US" w:eastAsia="zh-CN" w:bidi="ar-SA"/>
+        </w:rPr>
+      </w:sdtEndPr>
+      <w:sdtContent>
+        <w:p>
+          <w:pPr>
+            <w:spacing w:before="0" w:beforeLines="0" w:after="0" w:afterLines="0" w:line="240" w:lineRule="auto"/>
+            <w:ind w:left="0" w:leftChars="0" w:right="0" w:rightChars="0" w:firstLine="0" w:firstLineChars="0"/>
+            <w:jc w:val="center"/>
+          </w:pPr>
+          <w:r>
+            <w:rPr>
+              <w:rFonts w:ascii="宋体" w:hAnsi="宋体" w:eastAsia="宋体"/>
+              <w:sz w:val="21"/>
+            </w:rPr>
+            <w:t>目录</w:t>
+          </w:r>
+        </w:p>
+        <w:p>
+          <w:pPr>
+            <w:pStyle w:val="9"/>
+            <w:tabs>
+              <w:tab w:val="right" w:leader="dot" w:pos="8306"/>
+            </w:tabs>
+          </w:pPr>
+          <w:r>
+            <w:rPr>
+              <w:rFonts w:hint="eastAsia" w:ascii="宋体" w:hAnsi="宋体" w:eastAsia="宋体" w:cs="宋体"/>
+              <w:kern w:val="2"/>
+              <w:sz w:val="21"/>
+              <w:szCs w:val="24"/>
+              <w:lang w:val="en-US" w:eastAsia="zh-CN" w:bidi="ar-SA"/>
+            </w:rPr>
+            <w:fldChar w:fldCharType="begin"/>
+          </w:r>
+          <w:r>
+            <w:rPr>
+              <w:rFonts w:hint="eastAsia" w:ascii="宋体" w:hAnsi="宋体" w:eastAsia="宋体" w:cs="宋体"/>
+              <w:kern w:val="2"/>
+              <w:sz w:val="21"/>
+              <w:szCs w:val="24"/>
+              <w:lang w:val="en-US" w:eastAsia="zh-CN" w:bidi="ar-SA"/>
+            </w:rPr>
+            <w:instrText xml:space="preserve">TOC \o "1-2" \h \u </w:instrText>
+          </w:r>
+          <w:r>
+            <w:rPr>
+              <w:rFonts w:hint="eastAsia" w:ascii="宋体" w:hAnsi="宋体" w:eastAsia="宋体" w:cs="宋体"/>
+              <w:kern w:val="2"/>
+              <w:sz w:val="21"/>
+              <w:szCs w:val="24"/>
+              <w:lang w:val="en-US" w:eastAsia="zh-CN" w:bidi="ar-SA"/>
+            </w:rPr>
+            <w:fldChar w:fldCharType="separate"/>
+          </w:r>
+          <w:r>
+            <w:rPr>
+              <w:rFonts w:hint="eastAsia" w:ascii="宋体" w:hAnsi="宋体" w:eastAsia="宋体" w:cs="宋体"/>
+              <w:kern w:val="2"/>
+              <w:szCs w:val="24"/>
+              <w:lang w:val="en-US" w:eastAsia="zh-CN" w:bidi="ar-SA"/>
+            </w:rPr>
+            <w:fldChar w:fldCharType="begin"/>
+          </w:r>
+          <w:r>
+            <w:rPr>
+              <w:rFonts w:hint="eastAsia" w:ascii="宋体" w:hAnsi="宋体" w:eastAsia="宋体" w:cs="宋体"/>
+              <w:kern w:val="2"/>
+              <w:szCs w:val="24"/>
+              <w:lang w:val="en-US" w:eastAsia="zh-CN" w:bidi="ar-SA"/>
+            </w:rPr>
+            <w:instrText xml:space="preserve"> HYPERLINK \l _Toc18341 </w:instrText>
+          </w:r>
+          <w:r>
+            <w:rPr>
+              <w:rFonts w:hint="eastAsia" w:ascii="宋体" w:hAnsi="宋体" w:eastAsia="宋体" w:cs="宋体"/>
+              <w:kern w:val="2"/>
+              <w:szCs w:val="24"/>
+              <w:lang w:val="en-US" w:eastAsia="zh-CN" w:bidi="ar-SA"/>
+            </w:rPr>
+            <w:fldChar w:fldCharType="separate"/>
+          </w:r>
+          <w:r>
+            <w:rPr>
+              <w:rFonts w:hint="eastAsia"/>
+              <w:lang w:val="en-US" w:eastAsia="zh-CN"/>
+            </w:rPr>
+            <w:t>开户指南</w:t>
+          </w:r>
+          <w:r>
+            <w:tab/>
+          </w:r>
+          <w:r>
+            <w:fldChar w:fldCharType="begin"/>
+          </w:r>
+          <w:r>
+            <w:instrText xml:space="preserve"> PAGEREF _Toc18341 \h </w:instrText>
+          </w:r>
+          <w:r>
+            <w:fldChar w:fldCharType="separate"/>
+          </w:r>
+          <w:r>
+            <w:t>2</w:t>
+          </w:r>
+          <w:r>
+            <w:fldChar w:fldCharType="end"/>
+          </w:r>
+          <w:r>
+            <w:rPr>
+              <w:rFonts w:hint="eastAsia" w:ascii="宋体" w:hAnsi="宋体" w:eastAsia="宋体" w:cs="宋体"/>
+              <w:kern w:val="2"/>
+              <w:szCs w:val="24"/>
+              <w:lang w:val="en-US" w:eastAsia="zh-CN" w:bidi="ar-SA"/>
+            </w:rPr>
+            <w:fldChar w:fldCharType="end"/>
+          </w:r>
+        </w:p>
+        <w:p>
+          <w:pPr>
+            <w:pStyle w:val="9"/>
+            <w:tabs>
+              <w:tab w:val="right" w:leader="dot" w:pos="8306"/>
+            </w:tabs>
+          </w:pPr>
+          <w:r>
+            <w:rPr>
+              <w:rFonts w:hint="eastAsia" w:ascii="宋体" w:hAnsi="宋体" w:eastAsia="宋体" w:cs="宋体"/>
+              <w:kern w:val="2"/>
+              <w:szCs w:val="24"/>
+              <w:lang w:val="en-US" w:eastAsia="zh-CN" w:bidi="ar-SA"/>
+            </w:rPr>
+            <w:fldChar w:fldCharType="begin"/>
+          </w:r>
+          <w:r>
+            <w:rPr>
+              <w:rFonts w:hint="eastAsia" w:ascii="宋体" w:hAnsi="宋体" w:eastAsia="宋体" w:cs="宋体"/>
+              <w:kern w:val="2"/>
+              <w:szCs w:val="24"/>
+              <w:lang w:val="en-US" w:eastAsia="zh-CN" w:bidi="ar-SA"/>
+            </w:rPr>
+            <w:instrText xml:space="preserve"> HYPERLINK \l _Toc24703 </w:instrText>
+          </w:r>
+          <w:r>
+            <w:rPr>
+              <w:rFonts w:hint="eastAsia" w:ascii="宋体" w:hAnsi="宋体" w:eastAsia="宋体" w:cs="宋体"/>
+              <w:kern w:val="2"/>
+              <w:szCs w:val="24"/>
+              <w:lang w:val="en-US" w:eastAsia="zh-CN" w:bidi="ar-SA"/>
+            </w:rPr>
+            <w:fldChar w:fldCharType="separate"/>
+          </w:r>
+          <w:r>
+            <w:rPr>
+              <w:rFonts w:hint="eastAsia"/>
+              <w:lang w:val="en-US" w:eastAsia="zh-CN"/>
+            </w:rPr>
+            <w:t>券商返利活动介绍</w:t>
+          </w:r>
+          <w:r>
+            <w:tab/>
+          </w:r>
+          <w:r>
+            <w:fldChar w:fldCharType="begin"/>
+          </w:r>
+          <w:r>
+            <w:instrText xml:space="preserve"> PAGEREF _Toc24703 \h </w:instrText>
+          </w:r>
+          <w:r>
+            <w:fldChar w:fldCharType="separate"/>
+          </w:r>
+          <w:r>
+            <w:t>5</w:t>
+          </w:r>
+          <w:r>
+            <w:fldChar w:fldCharType="end"/>
+          </w:r>
+          <w:r>
+            <w:rPr>
+              <w:rFonts w:hint="eastAsia" w:ascii="宋体" w:hAnsi="宋体" w:eastAsia="宋体" w:cs="宋体"/>
+              <w:kern w:val="2"/>
+              <w:szCs w:val="24"/>
+              <w:lang w:val="en-US" w:eastAsia="zh-CN" w:bidi="ar-SA"/>
+            </w:rPr>
+            <w:fldChar w:fldCharType="end"/>
+          </w:r>
+        </w:p>
+        <w:p>
+          <w:pPr>
+            <w:pStyle w:val="9"/>
+            <w:tabs>
+              <w:tab w:val="right" w:leader="dot" w:pos="8306"/>
+            </w:tabs>
+          </w:pPr>
+          <w:r>
+            <w:rPr>
+              <w:rFonts w:hint="eastAsia" w:ascii="宋体" w:hAnsi="宋体" w:eastAsia="宋体" w:cs="宋体"/>
+              <w:kern w:val="2"/>
+              <w:szCs w:val="24"/>
+              <w:lang w:val="en-US" w:eastAsia="zh-CN" w:bidi="ar-SA"/>
+            </w:rPr>
+            <w:fldChar w:fldCharType="begin"/>
+          </w:r>
+          <w:r>
+            <w:rPr>
+              <w:rFonts w:hint="eastAsia" w:ascii="宋体" w:hAnsi="宋体" w:eastAsia="宋体" w:cs="宋体"/>
+              <w:kern w:val="2"/>
+              <w:szCs w:val="24"/>
+              <w:lang w:val="en-US" w:eastAsia="zh-CN" w:bidi="ar-SA"/>
+            </w:rPr>
+            <w:instrText xml:space="preserve"> HYPERLINK \l _Toc9139 </w:instrText>
+          </w:r>
+          <w:r>
+            <w:rPr>
+              <w:rFonts w:hint="eastAsia" w:ascii="宋体" w:hAnsi="宋体" w:eastAsia="宋体" w:cs="宋体"/>
+              <w:kern w:val="2"/>
+              <w:szCs w:val="24"/>
+              <w:lang w:val="en-US" w:eastAsia="zh-CN" w:bidi="ar-SA"/>
+            </w:rPr>
+            <w:fldChar w:fldCharType="separate"/>
+          </w:r>
+          <w:r>
+            <w:rPr>
+              <w:rFonts w:hint="eastAsia"/>
+              <w:lang w:val="en-US" w:eastAsia="zh-CN"/>
+            </w:rPr>
+            <w:t>盈立证券新加坡</w:t>
+          </w:r>
+          <w:r>
+            <w:tab/>
+          </w:r>
+          <w:r>
+            <w:fldChar w:fldCharType="begin"/>
+          </w:r>
+          <w:r>
+            <w:instrText xml:space="preserve"> PAGEREF _Toc9139 \h </w:instrText>
+          </w:r>
+          <w:r>
+            <w:fldChar w:fldCharType="separate"/>
+          </w:r>
+          <w:r>
+            <w:t>5</w:t>
+          </w:r>
+          <w:r>
+            <w:fldChar w:fldCharType="end"/>
+          </w:r>
+          <w:r>
+            <w:rPr>
+              <w:rFonts w:hint="eastAsia" w:ascii="宋体" w:hAnsi="宋体" w:eastAsia="宋体" w:cs="宋体"/>
+              <w:kern w:val="2"/>
+              <w:szCs w:val="24"/>
+              <w:lang w:val="en-US" w:eastAsia="zh-CN" w:bidi="ar-SA"/>
+            </w:rPr>
+            <w:fldChar w:fldCharType="end"/>
+          </w:r>
+        </w:p>
+        <w:p>
+          <w:pPr>
+            <w:pStyle w:val="9"/>
+            <w:tabs>
+              <w:tab w:val="right" w:leader="dot" w:pos="8306"/>
+            </w:tabs>
+          </w:pPr>
+          <w:r>
+            <w:rPr>
+              <w:rFonts w:hint="eastAsia" w:ascii="宋体" w:hAnsi="宋体" w:eastAsia="宋体" w:cs="宋体"/>
+              <w:kern w:val="2"/>
+              <w:szCs w:val="24"/>
+              <w:lang w:val="en-US" w:eastAsia="zh-CN" w:bidi="ar-SA"/>
+            </w:rPr>
+            <w:fldChar w:fldCharType="begin"/>
+          </w:r>
+          <w:r>
+            <w:rPr>
+              <w:rFonts w:hint="eastAsia" w:ascii="宋体" w:hAnsi="宋体" w:eastAsia="宋体" w:cs="宋体"/>
+              <w:kern w:val="2"/>
+              <w:szCs w:val="24"/>
+              <w:lang w:val="en-US" w:eastAsia="zh-CN" w:bidi="ar-SA"/>
+            </w:rPr>
+            <w:instrText xml:space="preserve"> HYPERLINK \l _Toc10557 </w:instrText>
+          </w:r>
+          <w:r>
+            <w:rPr>
+              <w:rFonts w:hint="eastAsia" w:ascii="宋体" w:hAnsi="宋体" w:eastAsia="宋体" w:cs="宋体"/>
+              <w:kern w:val="2"/>
+              <w:szCs w:val="24"/>
+              <w:lang w:val="en-US" w:eastAsia="zh-CN" w:bidi="ar-SA"/>
+            </w:rPr>
+            <w:fldChar w:fldCharType="separate"/>
+          </w:r>
+          <w:r>
+            <w:rPr>
+              <w:rFonts w:hint="eastAsia"/>
+              <w:lang w:val="en-US" w:eastAsia="zh-CN"/>
+            </w:rPr>
+            <w:t>复星证券（星财富）</w:t>
+          </w:r>
+          <w:r>
+            <w:tab/>
+          </w:r>
+          <w:r>
+            <w:fldChar w:fldCharType="begin"/>
+          </w:r>
+          <w:r>
+            <w:instrText xml:space="preserve"> PAGEREF _Toc10557 \h </w:instrText>
+          </w:r>
+          <w:r>
+            <w:fldChar w:fldCharType="separate"/>
+          </w:r>
+          <w:r>
+            <w:t>6</w:t>
+          </w:r>
+          <w:r>
+            <w:fldChar w:fldCharType="end"/>
+          </w:r>
+          <w:r>
+            <w:rPr>
+              <w:rFonts w:hint="eastAsia" w:ascii="宋体" w:hAnsi="宋体" w:eastAsia="宋体" w:cs="宋体"/>
+              <w:kern w:val="2"/>
+              <w:szCs w:val="24"/>
+              <w:lang w:val="en-US" w:eastAsia="zh-CN" w:bidi="ar-SA"/>
+            </w:rPr>
+            <w:fldChar w:fldCharType="end"/>
+          </w:r>
+        </w:p>
+        <w:p>
+          <w:pPr>
+            <w:pStyle w:val="9"/>
+            <w:tabs>
+              <w:tab w:val="right" w:leader="dot" w:pos="8306"/>
+            </w:tabs>
+          </w:pPr>
+          <w:r>
+            <w:rPr>
+              <w:rFonts w:hint="eastAsia" w:ascii="宋体" w:hAnsi="宋体" w:eastAsia="宋体" w:cs="宋体"/>
+              <w:kern w:val="2"/>
+              <w:szCs w:val="24"/>
+              <w:lang w:val="en-US" w:eastAsia="zh-CN" w:bidi="ar-SA"/>
+            </w:rPr>
+            <w:fldChar w:fldCharType="begin"/>
+          </w:r>
+          <w:r>
+            <w:rPr>
+              <w:rFonts w:hint="eastAsia" w:ascii="宋体" w:hAnsi="宋体" w:eastAsia="宋体" w:cs="宋体"/>
+              <w:kern w:val="2"/>
+              <w:szCs w:val="24"/>
+              <w:lang w:val="en-US" w:eastAsia="zh-CN" w:bidi="ar-SA"/>
+            </w:rPr>
+            <w:instrText xml:space="preserve"> HYPERLINK \l _Toc476 </w:instrText>
+          </w:r>
+          <w:r>
+            <w:rPr>
+              <w:rFonts w:hint="eastAsia" w:ascii="宋体" w:hAnsi="宋体" w:eastAsia="宋体" w:cs="宋体"/>
+              <w:kern w:val="2"/>
+              <w:szCs w:val="24"/>
+              <w:lang w:val="en-US" w:eastAsia="zh-CN" w:bidi="ar-SA"/>
+            </w:rPr>
+            <w:fldChar w:fldCharType="separate"/>
+          </w:r>
+          <w:r>
+            <w:rPr>
+              <w:rFonts w:hint="eastAsia"/>
+              <w:lang w:val="en-US" w:eastAsia="zh-CN"/>
+            </w:rPr>
+            <w:t>众安银行</w:t>
+          </w:r>
+          <w:r>
+            <w:tab/>
+          </w:r>
+          <w:r>
+            <w:fldChar w:fldCharType="begin"/>
+          </w:r>
+          <w:r>
+            <w:instrText xml:space="preserve"> PAGEREF _Toc476 \h </w:instrText>
+          </w:r>
+          <w:r>
+            <w:fldChar w:fldCharType="separate"/>
+          </w:r>
+          <w:r>
+            <w:t>8</w:t>
+          </w:r>
+          <w:r>
+            <w:fldChar w:fldCharType="end"/>
+          </w:r>
+          <w:r>
+            <w:rPr>
+              <w:rFonts w:hint="eastAsia" w:ascii="宋体" w:hAnsi="宋体" w:eastAsia="宋体" w:cs="宋体"/>
+              <w:kern w:val="2"/>
+              <w:szCs w:val="24"/>
+              <w:lang w:val="en-US" w:eastAsia="zh-CN" w:bidi="ar-SA"/>
+            </w:rPr>
+            <w:fldChar w:fldCharType="end"/>
+          </w:r>
+        </w:p>
+        <w:p>
+          <w:pPr>
+            <w:pStyle w:val="9"/>
+            <w:tabs>
+              <w:tab w:val="right" w:leader="dot" w:pos="8306"/>
+            </w:tabs>
+          </w:pPr>
+          <w:r>
+            <w:rPr>
+              <w:rFonts w:hint="eastAsia" w:ascii="宋体" w:hAnsi="宋体" w:eastAsia="宋体" w:cs="宋体"/>
+              <w:kern w:val="2"/>
+              <w:szCs w:val="24"/>
+              <w:lang w:val="en-US" w:eastAsia="zh-CN" w:bidi="ar-SA"/>
+            </w:rPr>
+            <w:fldChar w:fldCharType="begin"/>
+          </w:r>
+          <w:r>
+            <w:rPr>
+              <w:rFonts w:hint="eastAsia" w:ascii="宋体" w:hAnsi="宋体" w:eastAsia="宋体" w:cs="宋体"/>
+              <w:kern w:val="2"/>
+              <w:szCs w:val="24"/>
+              <w:lang w:val="en-US" w:eastAsia="zh-CN" w:bidi="ar-SA"/>
+            </w:rPr>
+            <w:instrText xml:space="preserve"> HYPERLINK \l _Toc30772 </w:instrText>
+          </w:r>
+          <w:r>
+            <w:rPr>
+              <w:rFonts w:hint="eastAsia" w:ascii="宋体" w:hAnsi="宋体" w:eastAsia="宋体" w:cs="宋体"/>
+              <w:kern w:val="2"/>
+              <w:szCs w:val="24"/>
+              <w:lang w:val="en-US" w:eastAsia="zh-CN" w:bidi="ar-SA"/>
+            </w:rPr>
+            <w:fldChar w:fldCharType="separate"/>
+          </w:r>
+          <w:r>
+            <w:rPr>
+              <w:rFonts w:hint="eastAsia"/>
+              <w:lang w:val="en-US" w:eastAsia="zh-CN"/>
+            </w:rPr>
+            <w:t>平安数字银行</w:t>
+          </w:r>
+          <w:r>
+            <w:tab/>
+          </w:r>
+          <w:r>
+            <w:fldChar w:fldCharType="begin"/>
+          </w:r>
+          <w:r>
+            <w:instrText xml:space="preserve"> PAGEREF _Toc30772 \h </w:instrText>
+          </w:r>
+          <w:r>
+            <w:fldChar w:fldCharType="separate"/>
+          </w:r>
+          <w:r>
+            <w:t>9</w:t>
+          </w:r>
+          <w:r>
+            <w:fldChar w:fldCharType="end"/>
+          </w:r>
+          <w:r>
+            <w:rPr>
+              <w:rFonts w:hint="eastAsia" w:ascii="宋体" w:hAnsi="宋体" w:eastAsia="宋体" w:cs="宋体"/>
+              <w:kern w:val="2"/>
+              <w:szCs w:val="24"/>
+              <w:lang w:val="en-US" w:eastAsia="zh-CN" w:bidi="ar-SA"/>
+            </w:rPr>
+            <w:fldChar w:fldCharType="end"/>
+          </w:r>
+        </w:p>
+        <w:p>
+          <w:pPr>
+            <w:pStyle w:val="9"/>
+            <w:tabs>
+              <w:tab w:val="right" w:leader="dot" w:pos="8306"/>
+            </w:tabs>
+          </w:pPr>
+          <w:r>
+            <w:rPr>
+              <w:rFonts w:hint="eastAsia" w:ascii="宋体" w:hAnsi="宋体" w:eastAsia="宋体" w:cs="宋体"/>
+              <w:kern w:val="2"/>
+              <w:szCs w:val="24"/>
+              <w:lang w:val="en-US" w:eastAsia="zh-CN" w:bidi="ar-SA"/>
+            </w:rPr>
+            <w:fldChar w:fldCharType="begin"/>
+          </w:r>
+          <w:r>
+            <w:rPr>
+              <w:rFonts w:hint="eastAsia" w:ascii="宋体" w:hAnsi="宋体" w:eastAsia="宋体" w:cs="宋体"/>
+              <w:kern w:val="2"/>
+              <w:szCs w:val="24"/>
+              <w:lang w:val="en-US" w:eastAsia="zh-CN" w:bidi="ar-SA"/>
+            </w:rPr>
+            <w:instrText xml:space="preserve"> HYPERLINK \l _Toc8380 </w:instrText>
+          </w:r>
+          <w:r>
+            <w:rPr>
+              <w:rFonts w:hint="eastAsia" w:ascii="宋体" w:hAnsi="宋体" w:eastAsia="宋体" w:cs="宋体"/>
+              <w:kern w:val="2"/>
+              <w:szCs w:val="24"/>
+              <w:lang w:val="en-US" w:eastAsia="zh-CN" w:bidi="ar-SA"/>
+            </w:rPr>
+            <w:fldChar w:fldCharType="separate"/>
+          </w:r>
+          <w:r>
+            <w:rPr>
+              <w:rFonts w:hint="eastAsia"/>
+              <w:lang w:val="en-US" w:eastAsia="zh-CN"/>
+            </w:rPr>
+            <w:t>澳门蚂蚁银行</w:t>
+          </w:r>
+          <w:r>
+            <w:tab/>
+          </w:r>
+          <w:r>
+            <w:fldChar w:fldCharType="begin"/>
+          </w:r>
+          <w:r>
+            <w:instrText xml:space="preserve"> PAGEREF _Toc8380 \h </w:instrText>
+          </w:r>
+          <w:r>
+            <w:fldChar w:fldCharType="separate"/>
+          </w:r>
+          <w:r>
+            <w:t>10</w:t>
+          </w:r>
+          <w:r>
+            <w:fldChar w:fldCharType="end"/>
+          </w:r>
+          <w:r>
+            <w:rPr>
+              <w:rFonts w:hint="eastAsia" w:ascii="宋体" w:hAnsi="宋体" w:eastAsia="宋体" w:cs="宋体"/>
+              <w:kern w:val="2"/>
+              <w:szCs w:val="24"/>
+              <w:lang w:val="en-US" w:eastAsia="zh-CN" w:bidi="ar-SA"/>
+            </w:rPr>
+            <w:fldChar w:fldCharType="end"/>
+          </w:r>
+        </w:p>
+        <w:p>
+          <w:pPr>
+            <w:pStyle w:val="9"/>
+            <w:tabs>
+              <w:tab w:val="right" w:leader="dot" w:pos="8306"/>
+            </w:tabs>
+          </w:pPr>
+          <w:r>
+            <w:rPr>
+              <w:rFonts w:hint="eastAsia" w:ascii="宋体" w:hAnsi="宋体" w:eastAsia="宋体" w:cs="宋体"/>
+              <w:kern w:val="2"/>
+              <w:szCs w:val="24"/>
+              <w:lang w:val="en-US" w:eastAsia="zh-CN" w:bidi="ar-SA"/>
+            </w:rPr>
+            <w:fldChar w:fldCharType="begin"/>
+          </w:r>
+          <w:r>
+            <w:rPr>
+              <w:rFonts w:hint="eastAsia" w:ascii="宋体" w:hAnsi="宋体" w:eastAsia="宋体" w:cs="宋体"/>
+              <w:kern w:val="2"/>
+              <w:szCs w:val="24"/>
+              <w:lang w:val="en-US" w:eastAsia="zh-CN" w:bidi="ar-SA"/>
+            </w:rPr>
+            <w:instrText xml:space="preserve"> HYPERLINK \l _Toc8164 </w:instrText>
+          </w:r>
+          <w:r>
+            <w:rPr>
+              <w:rFonts w:hint="eastAsia" w:ascii="宋体" w:hAnsi="宋体" w:eastAsia="宋体" w:cs="宋体"/>
+              <w:kern w:val="2"/>
+              <w:szCs w:val="24"/>
+              <w:lang w:val="en-US" w:eastAsia="zh-CN" w:bidi="ar-SA"/>
+            </w:rPr>
+            <w:fldChar w:fldCharType="separate"/>
+          </w:r>
+          <w:r>
+            <w:rPr>
+              <w:rFonts w:hint="eastAsia"/>
+              <w:lang w:val="en-US" w:eastAsia="zh-CN"/>
+            </w:rPr>
+            <w:t>腾达证券(GigaMoney)</w:t>
+          </w:r>
+          <w:r>
+            <w:tab/>
+          </w:r>
+          <w:r>
+            <w:fldChar w:fldCharType="begin"/>
+          </w:r>
+          <w:r>
+            <w:instrText xml:space="preserve"> PAGEREF _Toc8164 \h </w:instrText>
+          </w:r>
+          <w:r>
+            <w:fldChar w:fldCharType="separate"/>
+          </w:r>
+          <w:r>
+            <w:t>13</w:t>
+          </w:r>
+          <w:r>
+            <w:fldChar w:fldCharType="end"/>
+          </w:r>
+          <w:r>
+            <w:rPr>
+              <w:rFonts w:hint="eastAsia" w:ascii="宋体" w:hAnsi="宋体" w:eastAsia="宋体" w:cs="宋体"/>
+              <w:kern w:val="2"/>
+              <w:szCs w:val="24"/>
+              <w:lang w:val="en-US" w:eastAsia="zh-CN" w:bidi="ar-SA"/>
+            </w:rPr>
+            <w:fldChar w:fldCharType="end"/>
+          </w:r>
+        </w:p>
+        <w:p>
+          <w:pPr>
+            <w:pStyle w:val="9"/>
+            <w:tabs>
+              <w:tab w:val="right" w:leader="dot" w:pos="8306"/>
+            </w:tabs>
+          </w:pPr>
+          <w:r>
+            <w:rPr>
+              <w:rFonts w:hint="eastAsia" w:ascii="宋体" w:hAnsi="宋体" w:eastAsia="宋体" w:cs="宋体"/>
+              <w:kern w:val="2"/>
+              <w:szCs w:val="24"/>
+              <w:lang w:val="en-US" w:eastAsia="zh-CN" w:bidi="ar-SA"/>
+            </w:rPr>
+            <w:fldChar w:fldCharType="begin"/>
+          </w:r>
+          <w:r>
+            <w:rPr>
+              <w:rFonts w:hint="eastAsia" w:ascii="宋体" w:hAnsi="宋体" w:eastAsia="宋体" w:cs="宋体"/>
+              <w:kern w:val="2"/>
+              <w:szCs w:val="24"/>
+              <w:lang w:val="en-US" w:eastAsia="zh-CN" w:bidi="ar-SA"/>
+            </w:rPr>
+            <w:instrText xml:space="preserve"> HYPERLINK \l _Toc9694 </w:instrText>
+          </w:r>
+          <w:r>
+            <w:rPr>
+              <w:rFonts w:hint="eastAsia" w:ascii="宋体" w:hAnsi="宋体" w:eastAsia="宋体" w:cs="宋体"/>
+              <w:kern w:val="2"/>
+              <w:szCs w:val="24"/>
+              <w:lang w:val="en-US" w:eastAsia="zh-CN" w:bidi="ar-SA"/>
+            </w:rPr>
+            <w:fldChar w:fldCharType="separate"/>
+          </w:r>
+          <w:r>
+            <w:rPr>
+              <w:rFonts w:hint="eastAsia"/>
+              <w:lang w:val="en-US" w:eastAsia="zh-CN"/>
+            </w:rPr>
+            <w:t>我的联系方式</w:t>
+          </w:r>
+          <w:r>
+            <w:tab/>
+          </w:r>
+          <w:r>
+            <w:fldChar w:fldCharType="begin"/>
+          </w:r>
+          <w:r>
+            <w:instrText xml:space="preserve"> PAGEREF _Toc9694 \h </w:instrText>
+          </w:r>
+          <w:r>
+            <w:fldChar w:fldCharType="separate"/>
+          </w:r>
+          <w:r>
+            <w:t>15</w:t>
+          </w:r>
+          <w:r>
+            <w:fldChar w:fldCharType="end"/>
+          </w:r>
+          <w:r>
+            <w:rPr>
+              <w:rFonts w:hint="eastAsia" w:ascii="宋体" w:hAnsi="宋体" w:eastAsia="宋体" w:cs="宋体"/>
+              <w:kern w:val="2"/>
+              <w:szCs w:val="24"/>
+              <w:lang w:val="en-US" w:eastAsia="zh-CN" w:bidi="ar-SA"/>
+            </w:rPr>
+            <w:fldChar w:fldCharType="end"/>
+          </w:r>
+        </w:p>
+        <w:p>
+          <w:pPr>
+            <w:rPr>
+              <w:rFonts w:hint="eastAsia" w:ascii="宋体" w:hAnsi="宋体" w:eastAsia="宋体" w:cs="宋体"/>
+              <w:kern w:val="2"/>
+              <w:sz w:val="21"/>
+              <w:szCs w:val="24"/>
+              <w:lang w:val="en-US" w:eastAsia="zh-CN" w:bidi="ar-SA"/>
+            </w:rPr>
+          </w:pPr>
+          <w:r>
+            <w:rPr>
+              <w:rFonts w:hint="eastAsia" w:ascii="宋体" w:hAnsi="宋体" w:eastAsia="宋体" w:cs="宋体"/>
+              <w:kern w:val="2"/>
+              <w:szCs w:val="24"/>
+              <w:lang w:val="en-US" w:eastAsia="zh-CN" w:bidi="ar-SA"/>
+            </w:rPr>
+            <w:fldChar w:fldCharType="end"/>
+          </w:r>
+          <w:bookmarkStart w:id="16" w:name="_GoBack"/>
+        </w:p>
+      </w:sdtContent>
+    </w:sdt>
+    <w:p>
+      <w:pPr>
+        <w:rPr>
+          <w:rFonts w:hint="eastAsia" w:ascii="宋体" w:hAnsi="宋体" w:eastAsia="宋体" w:cs="宋体"/>
+          <w:kern w:val="2"/>
+          <w:sz w:val="21"/>
+          <w:szCs w:val="24"/>
+          <w:lang w:val="en-US" w:eastAsia="zh-CN" w:bidi="ar-SA"/>
+        </w:rPr>
+        <w:sectPr>
+          <w:pgSz w:w="11906" w:h="16838"/>
+          <w:pgMar w:top="1440" w:right="1800" w:bottom="1440" w:left="1800" w:header="851" w:footer="992" w:gutter="0"/>
+          <w:cols w:space="425" w:num="1"/>
+          <w:docGrid w:type="lines" w:linePitch="312" w:charSpace="0"/>
+        </w:sectPr>
+      </w:pPr>
+    </w:p>
+    <w:bookmarkEnd w:id="16"/>
     <w:p>
       <w:pPr>
         <w:rPr>
@@ -40,7 +772,7 @@
       </w:r>
       <w:r>
         <w:rPr>
-          <w:rStyle w:val="11"/>
+          <w:rStyle w:val="15"/>
           <w:rFonts w:hint="eastAsia" w:ascii="宋体" w:hAnsi="宋体" w:eastAsia="宋体" w:cs="宋体"/>
           <w:sz w:val="24"/>
           <w:szCs w:val="24"/>
@@ -87,6 +819,8 @@
           <w:lang w:val="en-US" w:eastAsia="zh-CN"/>
         </w:rPr>
       </w:pPr>
+      <w:bookmarkStart w:id="0" w:name="_Toc20476"/>
+      <w:bookmarkStart w:id="1" w:name="_Toc18341"/>
       <w:r>
         <w:rPr>
           <w:rFonts w:hint="eastAsia"/>
@@ -94,6 +828,8 @@
         </w:rPr>
         <w:t>开户指南</w:t>
       </w:r>
+      <w:bookmarkEnd w:id="0"/>
+      <w:bookmarkEnd w:id="1"/>
     </w:p>
     <w:p>
       <w:pPr>
@@ -105,6 +841,7 @@
           <w:lang w:val="en-US" w:eastAsia="zh-CN"/>
         </w:rPr>
       </w:pPr>
+      <w:bookmarkStart w:id="2" w:name="_Toc16769"/>
       <w:r>
         <w:rPr>
           <w:rFonts w:hint="default"/>
@@ -128,7 +865,7 @@
       </w:r>
       <w:r>
         <w:rPr>
-          <w:rStyle w:val="11"/>
+          <w:rStyle w:val="15"/>
           <w:rFonts w:hint="default"/>
           <w:lang w:val="en-US" w:eastAsia="zh-CN"/>
         </w:rPr>
@@ -141,6 +878,7 @@
         </w:rPr>
         <w:fldChar w:fldCharType="end"/>
       </w:r>
+      <w:bookmarkEnd w:id="2"/>
     </w:p>
     <w:p>
       <w:pPr>
@@ -183,7 +921,7 @@
     </w:p>
     <w:p>
       <w:pPr>
-        <w:pStyle w:val="7"/>
+        <w:pStyle w:val="11"/>
         <w:keepNext w:val="0"/>
         <w:keepLines w:val="0"/>
         <w:widowControl/>
@@ -219,7 +957,7 @@
     </w:p>
     <w:p>
       <w:pPr>
-        <w:pStyle w:val="7"/>
+        <w:pStyle w:val="11"/>
         <w:keepNext w:val="0"/>
         <w:keepLines w:val="0"/>
         <w:widowControl/>
@@ -316,7 +1054,7 @@
     </w:p>
     <w:p>
       <w:pPr>
-        <w:pStyle w:val="7"/>
+        <w:pStyle w:val="11"/>
         <w:keepNext w:val="0"/>
         <w:keepLines w:val="0"/>
         <w:widowControl/>
@@ -356,7 +1094,7 @@
     </w:p>
     <w:p>
       <w:pPr>
-        <w:pStyle w:val="7"/>
+        <w:pStyle w:val="11"/>
         <w:keepNext w:val="0"/>
         <w:keepLines w:val="0"/>
         <w:widowControl/>
@@ -570,16 +1308,18 @@
         <w:pStyle w:val="5"/>
         <w:bidi w:val="0"/>
       </w:pPr>
+      <w:bookmarkStart w:id="3" w:name="_Toc11593"/>
       <w:r>
         <w:rPr>
           <w:rFonts w:hint="default"/>
         </w:rPr>
         <w:t>流程步骤</w:t>
       </w:r>
-    </w:p>
-    <w:p>
-      <w:pPr>
-        <w:pStyle w:val="7"/>
+      <w:bookmarkEnd w:id="3"/>
+    </w:p>
+    <w:p>
+      <w:pPr>
+        <w:pStyle w:val="11"/>
         <w:keepNext w:val="0"/>
         <w:keepLines w:val="0"/>
         <w:widowControl/>
@@ -615,7 +1355,7 @@
     </w:p>
     <w:p>
       <w:pPr>
-        <w:pStyle w:val="7"/>
+        <w:pStyle w:val="11"/>
         <w:keepNext w:val="0"/>
         <w:keepLines w:val="0"/>
         <w:widowControl/>
@@ -651,7 +1391,7 @@
     </w:p>
     <w:p>
       <w:pPr>
-        <w:pStyle w:val="7"/>
+        <w:pStyle w:val="11"/>
         <w:keepNext w:val="0"/>
         <w:keepLines w:val="0"/>
         <w:widowControl/>
@@ -716,7 +1456,7 @@
     </w:p>
     <w:p>
       <w:pPr>
-        <w:pStyle w:val="7"/>
+        <w:pStyle w:val="11"/>
         <w:keepNext w:val="0"/>
         <w:keepLines w:val="0"/>
         <w:widowControl/>
@@ -839,7 +1579,7 @@
     </w:p>
     <w:p>
       <w:pPr>
-        <w:pStyle w:val="7"/>
+        <w:pStyle w:val="11"/>
         <w:keepNext w:val="0"/>
         <w:keepLines w:val="0"/>
         <w:widowControl/>
@@ -875,7 +1615,7 @@
     </w:p>
     <w:p>
       <w:pPr>
-        <w:pStyle w:val="7"/>
+        <w:pStyle w:val="11"/>
         <w:keepNext w:val="0"/>
         <w:keepLines w:val="0"/>
         <w:widowControl/>
@@ -969,7 +1709,7 @@
     </w:p>
     <w:p>
       <w:pPr>
-        <w:pStyle w:val="7"/>
+        <w:pStyle w:val="11"/>
         <w:keepNext w:val="0"/>
         <w:keepLines w:val="0"/>
         <w:widowControl/>
@@ -1063,7 +1803,7 @@
     </w:p>
     <w:p>
       <w:pPr>
-        <w:pStyle w:val="7"/>
+        <w:pStyle w:val="11"/>
         <w:keepNext w:val="0"/>
         <w:keepLines w:val="0"/>
         <w:widowControl/>
@@ -1099,7 +1839,7 @@
     </w:p>
     <w:p>
       <w:pPr>
-        <w:pStyle w:val="7"/>
+        <w:pStyle w:val="11"/>
         <w:keepNext w:val="0"/>
         <w:keepLines w:val="0"/>
         <w:widowControl/>
@@ -1135,7 +1875,7 @@
     </w:p>
     <w:p>
       <w:pPr>
-        <w:pStyle w:val="7"/>
+        <w:pStyle w:val="11"/>
         <w:keepNext w:val="0"/>
         <w:keepLines w:val="0"/>
         <w:widowControl/>
@@ -1215,7 +1955,7 @@
     </w:p>
     <w:p>
       <w:pPr>
-        <w:pStyle w:val="7"/>
+        <w:pStyle w:val="11"/>
         <w:keepNext w:val="0"/>
         <w:keepLines w:val="0"/>
         <w:widowControl/>
@@ -1252,7 +1992,7 @@
     </w:p>
     <w:p>
       <w:pPr>
-        <w:pStyle w:val="7"/>
+        <w:pStyle w:val="11"/>
         <w:keepNext w:val="0"/>
         <w:keepLines w:val="0"/>
         <w:widowControl/>
@@ -1311,6 +2051,7 @@
           <w:lang w:val="en-US" w:eastAsia="zh-CN"/>
         </w:rPr>
       </w:pPr>
+      <w:bookmarkStart w:id="4" w:name="_Toc30360"/>
       <w:r>
         <w:rPr>
           <w:rFonts w:hint="default"/>
@@ -1324,10 +2065,11 @@
         </w:rPr>
         <w:t xml:space="preserve"> !!!!</w:t>
       </w:r>
-    </w:p>
-    <w:p>
-      <w:pPr>
-        <w:pStyle w:val="7"/>
+      <w:bookmarkEnd w:id="4"/>
+    </w:p>
+    <w:p>
+      <w:pPr>
+        <w:pStyle w:val="11"/>
         <w:keepNext w:val="0"/>
         <w:keepLines w:val="0"/>
         <w:widowControl/>
@@ -1670,7 +2412,7 @@
     </w:p>
     <w:p>
       <w:pPr>
-        <w:pStyle w:val="7"/>
+        <w:pStyle w:val="11"/>
         <w:keepNext w:val="0"/>
         <w:keepLines w:val="0"/>
         <w:widowControl/>
@@ -1764,7 +2506,7 @@
     </w:p>
     <w:p>
       <w:pPr>
-        <w:pStyle w:val="7"/>
+        <w:pStyle w:val="11"/>
         <w:keepNext w:val="0"/>
         <w:keepLines w:val="0"/>
         <w:widowControl/>
@@ -1889,7 +2631,7 @@
     </w:p>
     <w:p>
       <w:pPr>
-        <w:pStyle w:val="7"/>
+        <w:pStyle w:val="11"/>
         <w:keepNext w:val="0"/>
         <w:keepLines w:val="0"/>
         <w:widowControl/>
@@ -1928,7 +2670,7 @@
     </w:p>
     <w:p>
       <w:pPr>
-        <w:pStyle w:val="7"/>
+        <w:pStyle w:val="11"/>
         <w:keepNext w:val="0"/>
         <w:keepLines w:val="0"/>
         <w:widowControl/>
@@ -1975,6 +2717,8 @@
           <w:lang w:val="en-US" w:eastAsia="zh-CN"/>
         </w:rPr>
       </w:pPr>
+      <w:bookmarkStart w:id="5" w:name="_Toc19361"/>
+      <w:bookmarkStart w:id="6" w:name="_Toc24703"/>
       <w:r>
         <w:rPr>
           <w:rFonts w:hint="eastAsia"/>
@@ -1982,17 +2726,18 @@
         </w:rPr>
         <w:t>券商返利活动介绍</w:t>
       </w:r>
-    </w:p>
-    <w:p>
-      <w:pPr>
-        <w:pStyle w:val="5"/>
+      <w:bookmarkEnd w:id="5"/>
+      <w:bookmarkEnd w:id="6"/>
+    </w:p>
+    <w:p>
+      <w:pPr>
         <w:bidi w:val="0"/>
-        <w:jc w:val="center"/>
-        <w:rPr>
-          <w:rFonts w:hint="default"/>
-          <w:lang w:val="en-US" w:eastAsia="zh-CN"/>
-        </w:rPr>
-      </w:pPr>
+        <w:rPr>
+          <w:rFonts w:hint="eastAsia"/>
+          <w:lang w:val="en-US" w:eastAsia="zh-CN"/>
+        </w:rPr>
+      </w:pPr>
+      <w:bookmarkStart w:id="7" w:name="_Toc29912"/>
       <w:r>
         <w:rPr>
           <w:rFonts w:hint="eastAsia"/>
@@ -2000,6 +2745,7 @@
         </w:rPr>
         <w:t>(活动奖励经常变化，以网站更新为准)</w:t>
       </w:r>
+      <w:bookmarkEnd w:id="7"/>
     </w:p>
     <w:p>
       <w:pPr>
@@ -2010,14 +2756,26 @@
           <w:lang w:val="en-US" w:eastAsia="zh-CN"/>
         </w:rPr>
       </w:pPr>
-      <w:r>
-        <w:rPr>
-          <w:rFonts w:hint="eastAsia"/>
-          <w:sz w:val="48"/>
-          <w:szCs w:val="48"/>
-          <w:lang w:val="en-US" w:eastAsia="zh-CN"/>
-        </w:rPr>
-        <w:t xml:space="preserve">盈立证券新加坡 </w:t>
+      <w:bookmarkStart w:id="8" w:name="_Toc3761"/>
+      <w:bookmarkStart w:id="9" w:name="_Toc9139"/>
+      <w:r>
+        <w:rPr>
+          <w:rStyle w:val="17"/>
+          <w:rFonts w:hint="eastAsia"/>
+          <w:lang w:val="en-US" w:eastAsia="zh-CN"/>
+        </w:rPr>
+        <w:t>盈立证券新加坡</w:t>
+      </w:r>
+      <w:bookmarkEnd w:id="8"/>
+      <w:bookmarkEnd w:id="9"/>
+      <w:r>
+        <w:rPr>
+          <w:rFonts w:hint="eastAsia"/>
+          <w:sz w:val="48"/>
+          <w:szCs w:val="48"/>
+          <w:lang w:val="en-US" w:eastAsia="zh-CN"/>
+        </w:rPr>
+        <w:t xml:space="preserve"> </w:t>
       </w:r>
       <w:r>
         <w:rPr>
@@ -2197,7 +2955,7 @@
       </w:r>
       <w:r>
         <w:rPr>
-          <w:rStyle w:val="11"/>
+          <w:rStyle w:val="15"/>
           <w:rFonts w:hint="default"/>
           <w:lang w:val="en-US" w:eastAsia="zh-CN"/>
         </w:rPr>
@@ -2306,7 +3064,7 @@
       </w:r>
       <w:r>
         <w:rPr>
-          <w:rStyle w:val="11"/>
+          <w:rStyle w:val="15"/>
           <w:rFonts w:hint="eastAsia"/>
           <w:sz w:val="18"/>
           <w:szCs w:val="18"/>
@@ -2343,14 +3101,24 @@
           <w:lang w:val="en-US" w:eastAsia="zh-CN"/>
         </w:rPr>
       </w:pPr>
-      <w:r>
-        <w:rPr>
-          <w:rFonts w:hint="eastAsia"/>
-          <w:sz w:val="48"/>
-          <w:szCs w:val="48"/>
-          <w:lang w:val="en-US" w:eastAsia="zh-CN"/>
-        </w:rPr>
-        <w:t xml:space="preserve">复星证券（星财富） </w:t>
+      <w:bookmarkStart w:id="10" w:name="_Toc10557"/>
+      <w:r>
+        <w:rPr>
+          <w:rStyle w:val="17"/>
+          <w:rFonts w:hint="eastAsia"/>
+          <w:lang w:val="en-US" w:eastAsia="zh-CN"/>
+        </w:rPr>
+        <w:t>复星证券（星财富）</w:t>
+      </w:r>
+      <w:bookmarkEnd w:id="10"/>
+      <w:r>
+        <w:rPr>
+          <w:rFonts w:hint="eastAsia"/>
+          <w:sz w:val="48"/>
+          <w:szCs w:val="48"/>
+          <w:lang w:val="en-US" w:eastAsia="zh-CN"/>
+        </w:rPr>
+        <w:t xml:space="preserve"> </w:t>
       </w:r>
       <w:r>
         <w:rPr>
@@ -2557,7 +3325,7 @@
       </w:r>
       <w:r>
         <w:rPr>
-          <w:rStyle w:val="11"/>
+          <w:rStyle w:val="15"/>
           <w:rFonts w:hint="eastAsia"/>
           <w:sz w:val="21"/>
           <w:szCs w:val="21"/>
@@ -2893,14 +3661,24 @@
           <w:lang w:val="en-US" w:eastAsia="zh-CN"/>
         </w:rPr>
       </w:pPr>
-      <w:r>
-        <w:rPr>
-          <w:rFonts w:hint="eastAsia"/>
-          <w:sz w:val="48"/>
-          <w:szCs w:val="48"/>
-          <w:lang w:val="en-US" w:eastAsia="zh-CN"/>
-        </w:rPr>
-        <w:t xml:space="preserve">众安银行 </w:t>
+      <w:bookmarkStart w:id="11" w:name="_Toc476"/>
+      <w:r>
+        <w:rPr>
+          <w:rStyle w:val="17"/>
+          <w:rFonts w:hint="eastAsia"/>
+          <w:lang w:val="en-US" w:eastAsia="zh-CN"/>
+        </w:rPr>
+        <w:t>众安银行</w:t>
+      </w:r>
+      <w:bookmarkEnd w:id="11"/>
+      <w:r>
+        <w:rPr>
+          <w:rFonts w:hint="eastAsia"/>
+          <w:sz w:val="48"/>
+          <w:szCs w:val="48"/>
+          <w:lang w:val="en-US" w:eastAsia="zh-CN"/>
+        </w:rPr>
+        <w:t xml:space="preserve"> </w:t>
       </w:r>
       <w:r>
         <w:rPr>
@@ -3167,40 +3945,40 @@
     <w:p>
       <w:pPr>
         <w:rPr>
-          <w:rFonts w:hint="default"/>
-          <w:sz w:val="48"/>
-          <w:szCs w:val="48"/>
-          <w:lang w:val="en-US" w:eastAsia="zh-CN"/>
-        </w:rPr>
-      </w:pPr>
-    </w:p>
-    <w:p>
-      <w:pPr>
-        <w:rPr>
-          <w:rFonts w:hint="eastAsia"/>
-          <w:sz w:val="48"/>
-          <w:szCs w:val="48"/>
-          <w:lang w:val="en-US" w:eastAsia="zh-CN"/>
-        </w:rPr>
-      </w:pPr>
-    </w:p>
-    <w:p>
-      <w:pPr>
-        <w:rPr>
-          <w:rFonts w:hint="default"/>
-          <w:sz w:val="21"/>
-          <w:szCs w:val="21"/>
-          <w:lang w:val="en-US" w:eastAsia="zh-CN"/>
-        </w:rPr>
-      </w:pPr>
-      <w:r>
-        <w:rPr>
-          <w:rFonts w:hint="eastAsia"/>
-          <w:sz w:val="48"/>
-          <w:szCs w:val="48"/>
-          <w:lang w:val="en-US" w:eastAsia="zh-CN"/>
-        </w:rPr>
-        <w:t xml:space="preserve">平安数字银行     </w:t>
+          <w:rFonts w:hint="eastAsia"/>
+          <w:sz w:val="48"/>
+          <w:szCs w:val="48"/>
+          <w:lang w:val="en-US" w:eastAsia="zh-CN"/>
+        </w:rPr>
+      </w:pPr>
+    </w:p>
+    <w:p>
+      <w:pPr>
+        <w:rPr>
+          <w:rFonts w:hint="default"/>
+          <w:sz w:val="21"/>
+          <w:szCs w:val="21"/>
+          <w:lang w:val="en-US" w:eastAsia="zh-CN"/>
+        </w:rPr>
+      </w:pPr>
+      <w:bookmarkStart w:id="12" w:name="_Toc30772"/>
+      <w:r>
+        <w:rPr>
+          <w:rStyle w:val="17"/>
+          <w:rFonts w:hint="eastAsia"/>
+          <w:lang w:val="en-US" w:eastAsia="zh-CN"/>
+        </w:rPr>
+        <w:t>平安数字银行</w:t>
+      </w:r>
+      <w:bookmarkEnd w:id="12"/>
+      <w:r>
+        <w:rPr>
+          <w:rFonts w:hint="eastAsia"/>
+          <w:sz w:val="48"/>
+          <w:szCs w:val="48"/>
+          <w:lang w:val="en-US" w:eastAsia="zh-CN"/>
+        </w:rPr>
+        <w:t xml:space="preserve">     </w:t>
       </w:r>
       <w:r>
         <w:rPr>
@@ -3480,14 +4258,24 @@
           <w:lang w:val="en-US" w:eastAsia="zh-CN"/>
         </w:rPr>
       </w:pPr>
-      <w:r>
-        <w:rPr>
-          <w:rFonts w:hint="eastAsia"/>
-          <w:sz w:val="48"/>
-          <w:szCs w:val="48"/>
-          <w:lang w:val="en-US" w:eastAsia="zh-CN"/>
-        </w:rPr>
-        <w:t xml:space="preserve">澳门蚂蚁银行（Antbank Macau） </w:t>
+      <w:bookmarkStart w:id="13" w:name="_Toc8380"/>
+      <w:r>
+        <w:rPr>
+          <w:rStyle w:val="17"/>
+          <w:rFonts w:hint="eastAsia"/>
+          <w:lang w:val="en-US" w:eastAsia="zh-CN"/>
+        </w:rPr>
+        <w:t>澳门蚂蚁银行</w:t>
+      </w:r>
+      <w:bookmarkEnd w:id="13"/>
+      <w:r>
+        <w:rPr>
+          <w:rFonts w:hint="eastAsia"/>
+          <w:sz w:val="48"/>
+          <w:szCs w:val="48"/>
+          <w:lang w:val="en-US" w:eastAsia="zh-CN"/>
+        </w:rPr>
+        <w:t xml:space="preserve">（Antbank Macau） </w:t>
       </w:r>
       <w:r>
         <w:rPr>
@@ -3629,86 +4417,28 @@
     </w:p>
     <w:p>
       <w:pPr>
-        <w:rPr>
-          <w:rFonts w:ascii="微软雅黑" w:hAnsi="微软雅黑" w:eastAsia="微软雅黑" w:cs="微软雅黑"/>
-          <w:i w:val="0"/>
-          <w:iCs w:val="0"/>
-          <w:caps w:val="0"/>
-          <w:color w:val="18191C"/>
-          <w:spacing w:val="0"/>
-          <w:sz w:val="21"/>
-          <w:szCs w:val="21"/>
-          <w:shd w:val="clear" w:fill="FFFFFF"/>
-        </w:rPr>
-      </w:pPr>
-      <w:r>
-        <w:rPr>
-          <w:rFonts w:ascii="微软雅黑" w:hAnsi="微软雅黑" w:eastAsia="微软雅黑" w:cs="微软雅黑"/>
-          <w:i w:val="0"/>
-          <w:iCs w:val="0"/>
-          <w:caps w:val="0"/>
-          <w:color w:val="18191C"/>
-          <w:spacing w:val="0"/>
-          <w:sz w:val="21"/>
-          <w:szCs w:val="21"/>
-          <w:shd w:val="clear" w:fill="FFFFFF"/>
-        </w:rPr>
+        <w:pStyle w:val="11"/>
+        <w:keepNext w:val="0"/>
+        <w:keepLines w:val="0"/>
+        <w:widowControl/>
+        <w:suppressLineNumbers w:val="0"/>
+      </w:pPr>
+      <w:r>
         <w:fldChar w:fldCharType="begin"/>
       </w:r>
       <w:r>
-        <w:rPr>
-          <w:rFonts w:ascii="微软雅黑" w:hAnsi="微软雅黑" w:eastAsia="微软雅黑" w:cs="微软雅黑"/>
-          <w:i w:val="0"/>
-          <w:iCs w:val="0"/>
-          <w:caps w:val="0"/>
-          <w:color w:val="18191C"/>
-          <w:spacing w:val="0"/>
-          <w:sz w:val="21"/>
-          <w:szCs w:val="21"/>
-          <w:shd w:val="clear" w:fill="FFFFFF"/>
-        </w:rPr>
-        <w:instrText xml:space="preserve"> HYPERLINK "https://render.alipay.com/p/c/180020570000149153/index.html?invite-code=LPBHNX8S&amp;utm_source=antbank_app_share" </w:instrText>
-      </w:r>
-      <w:r>
-        <w:rPr>
-          <w:rFonts w:ascii="微软雅黑" w:hAnsi="微软雅黑" w:eastAsia="微软雅黑" w:cs="微软雅黑"/>
-          <w:i w:val="0"/>
-          <w:iCs w:val="0"/>
-          <w:caps w:val="0"/>
-          <w:color w:val="18191C"/>
-          <w:spacing w:val="0"/>
-          <w:sz w:val="21"/>
-          <w:szCs w:val="21"/>
-          <w:shd w:val="clear" w:fill="FFFFFF"/>
-        </w:rPr>
+        <w:instrText xml:space="preserve"> HYPERLINK "https://m.antbank.mo/s/6QQBK" </w:instrText>
+      </w:r>
+      <w:r>
         <w:fldChar w:fldCharType="separate"/>
       </w:r>
       <w:r>
         <w:rPr>
-          <w:rStyle w:val="11"/>
-          <w:rFonts w:ascii="微软雅黑" w:hAnsi="微软雅黑" w:eastAsia="微软雅黑" w:cs="微软雅黑"/>
-          <w:i w:val="0"/>
-          <w:iCs w:val="0"/>
-          <w:caps w:val="0"/>
-          <w:spacing w:val="0"/>
-          <w:sz w:val="21"/>
-          <w:szCs w:val="21"/>
-          <w:shd w:val="clear" w:fill="FFFFFF"/>
-        </w:rPr>
-        <w:t>https://render.alipay.com/p/c/180020570000149153/index.html?invite-code=LPBHNX8S&amp;utm_source=antbank_app_share</w:t>
-      </w:r>
-      <w:r>
-        <w:rPr>
-          <w:rFonts w:ascii="微软雅黑" w:hAnsi="微软雅黑" w:eastAsia="微软雅黑" w:cs="微软雅黑"/>
-          <w:i w:val="0"/>
-          <w:iCs w:val="0"/>
-          <w:caps w:val="0"/>
-          <w:color w:val="18191C"/>
-          <w:spacing w:val="0"/>
-          <w:sz w:val="21"/>
-          <w:szCs w:val="21"/>
-          <w:shd w:val="clear" w:fill="FFFFFF"/>
-        </w:rPr>
+          <w:rStyle w:val="14"/>
+        </w:rPr>
+        <w:t>https://m.antbank.mo/s/6QQBK</w:t>
+      </w:r>
+      <w:r>
         <w:fldChar w:fldCharType="end"/>
       </w:r>
     </w:p>
@@ -4044,7 +4774,7 @@
           <wp:inline distT="0" distB="0" distL="114300" distR="114300">
             <wp:extent cx="1440815" cy="2498725"/>
             <wp:effectExtent l="0" t="0" r="6985" b="3175"/>
-            <wp:docPr id="5" name="图片 5" descr="macau-ant-2"/>
+            <wp:docPr id="5" name="图片 5" descr="E:/论坛/蚂蚁从汇丰入金后怎么操作/p3.jpgp3"/>
             <wp:cNvGraphicFramePr>
               <a:graphicFrameLocks xmlns:a="http://schemas.openxmlformats.org/drawingml/2006/main" noChangeAspect="1"/>
             </wp:cNvGraphicFramePr>
@@ -4052,13 +4782,14 @@
               <a:graphicData uri="http://schemas.openxmlformats.org/drawingml/2006/picture">
                 <pic:pic xmlns:pic="http://schemas.openxmlformats.org/drawingml/2006/picture">
                   <pic:nvPicPr>
-                    <pic:cNvPr id="5" name="图片 5" descr="macau-ant-2"/>
+                    <pic:cNvPr id="5" name="图片 5" descr="E:/论坛/蚂蚁从汇丰入金后怎么操作/p3.jpgp3"/>
                     <pic:cNvPicPr>
                       <a:picLocks noChangeAspect="1"/>
                     </pic:cNvPicPr>
                   </pic:nvPicPr>
                   <pic:blipFill>
                     <a:blip r:embed="rId8"/>
+                    <a:srcRect t="6258" b="6258"/>
                     <a:stretch>
                       <a:fillRect/>
                     </a:stretch>
@@ -4090,7 +4821,21 @@
           <w:rFonts w:hint="default"/>
           <w:lang w:val="en-US" w:eastAsia="zh-CN"/>
         </w:rPr>
-        <w:t>- 填写邀请码 LPBHNX8S，完成后截圖发送给我</w:t>
+        <w:t>- 填写邀请码 LPBHNX8S，</w:t>
+      </w:r>
+      <w:r>
+        <w:rPr>
+          <w:rFonts w:hint="eastAsia"/>
+          <w:lang w:val="en-US" w:eastAsia="zh-CN"/>
+        </w:rPr>
+        <w:t>显示Kirinchew则是绑定成功,</w:t>
+      </w:r>
+      <w:r>
+        <w:rPr>
+          <w:rFonts w:hint="default"/>
+          <w:lang w:val="en-US" w:eastAsia="zh-CN"/>
+        </w:rPr>
+        <w:t>完成后截圖发送给我</w:t>
       </w:r>
     </w:p>
     <w:p/>
@@ -4296,20 +5041,6 @@
           <w:lang w:val="en-US" w:eastAsia="zh-CN"/>
         </w:rPr>
         <w:t>- 放30天可以领取2股小米</w:t>
-      </w:r>
-    </w:p>
-    <w:p>
-      <w:pPr>
-        <w:rPr>
-          <w:rFonts w:hint="default"/>
-        </w:rPr>
-      </w:pPr>
-      <w:r>
-        <w:rPr>
-          <w:rFonts w:hint="default"/>
-          <w:lang w:val="en-US" w:eastAsia="zh-CN"/>
-        </w:rPr>
-        <w:t>- 期间可以买股票，只要不把钱提出活期余额就行</w:t>
       </w:r>
     </w:p>
     <w:p>
@@ -4325,50 +5056,653 @@
           <w:docGrid w:type="lines" w:linePitch="312" w:charSpace="0"/>
         </w:sectPr>
       </w:pPr>
-    </w:p>
-    <w:p>
-      <w:pPr>
-        <w:rPr>
-          <w:rFonts w:hint="eastAsia"/>
-          <w:sz w:val="48"/>
-          <w:szCs w:val="48"/>
-          <w:lang w:val="en-US" w:eastAsia="zh-CN"/>
-        </w:rPr>
-      </w:pPr>
-    </w:p>
-    <w:p>
-      <w:pPr>
-        <w:rPr>
-          <w:rFonts w:hint="eastAsia"/>
-          <w:sz w:val="48"/>
-          <w:szCs w:val="48"/>
-          <w:lang w:val="en-US" w:eastAsia="zh-CN"/>
-        </w:rPr>
-      </w:pPr>
-      <w:r>
-        <w:rPr>
-          <w:rFonts w:hint="eastAsia"/>
-          <w:sz w:val="48"/>
-          <w:szCs w:val="48"/>
-          <w:lang w:val="en-US" w:eastAsia="zh-CN"/>
-        </w:rPr>
-        <w:t xml:space="preserve">我的联系方式 </w:t>
-      </w:r>
-    </w:p>
-    <w:p>
-      <w:pPr>
-        <w:rPr>
-          <w:rFonts w:hint="eastAsia"/>
-          <w:sz w:val="48"/>
-          <w:szCs w:val="48"/>
-          <w:lang w:val="en-US" w:eastAsia="zh-CN"/>
-        </w:rPr>
-      </w:pPr>
-    </w:p>
-    <w:p>
-      <w:pPr>
-        <w:rPr>
-          <w:rFonts w:hint="default"/>
+      <w:r>
+        <w:rPr>
+          <w:rFonts w:hint="default"/>
+          <w:lang w:val="en-US" w:eastAsia="zh-CN"/>
+        </w:rPr>
+        <w:t>- 期间可以买股票，只要不把钱提出活期余额就</w:t>
+      </w:r>
+      <w:r>
+        <w:rPr>
+          <w:rFonts w:hint="eastAsia"/>
+          <w:lang w:val="en-US" w:eastAsia="zh-CN"/>
+        </w:rPr>
+        <w:t>可以</w:t>
+      </w:r>
+    </w:p>
+    <w:p>
+      <w:pPr>
+        <w:pStyle w:val="2"/>
+        <w:bidi w:val="0"/>
+        <w:rPr>
+          <w:rFonts w:hint="eastAsia"/>
+          <w:lang w:val="en-US" w:eastAsia="zh-CN"/>
+        </w:rPr>
+      </w:pPr>
+      <w:bookmarkStart w:id="14" w:name="_Toc8164"/>
+      <w:r>
+        <w:rPr>
+          <w:rFonts w:hint="eastAsia"/>
+          <w:lang w:val="en-US" w:eastAsia="zh-CN"/>
+        </w:rPr>
+        <w:t>腾达证券(GigaMoney)</w:t>
+      </w:r>
+      <w:bookmarkEnd w:id="14"/>
+    </w:p>
+    <w:p>
+      <w:pPr>
+        <w:rPr>
+          <w:rFonts w:hint="eastAsia"/>
+          <w:lang w:val="en-US" w:eastAsia="zh-CN"/>
+        </w:rPr>
+      </w:pPr>
+      <w:r>
+        <w:rPr>
+          <w:rFonts w:hint="eastAsia"/>
+          <w:lang w:val="en-US" w:eastAsia="zh-CN"/>
+        </w:rPr>
+        <w:t>2026.10月活动</w:t>
+      </w:r>
+    </w:p>
+    <w:p>
+      <w:pPr>
+        <w:rPr>
+          <w:rFonts w:hint="eastAsia"/>
+          <w:lang w:val="en-US" w:eastAsia="zh-CN"/>
+        </w:rPr>
+      </w:pPr>
+    </w:p>
+    <w:p>
+      <w:pPr>
+        <w:rPr>
+          <w:rFonts w:hint="eastAsia"/>
+          <w:sz w:val="48"/>
+          <w:szCs w:val="48"/>
+          <w:lang w:val="en-US" w:eastAsia="zh-CN"/>
+        </w:rPr>
+      </w:pPr>
+      <w:r>
+        <w:rPr>
+          <w:rFonts w:hint="eastAsia"/>
+          <w:sz w:val="48"/>
+          <w:szCs w:val="48"/>
+          <w:lang w:val="en-US" w:eastAsia="zh-CN"/>
+        </w:rPr>
+        <w:t>VIP邀请码 XD7NRTBL</w:t>
+      </w:r>
+    </w:p>
+    <w:p>
+      <w:pPr>
+        <w:rPr>
+          <w:rFonts w:hint="default"/>
+          <w:sz w:val="48"/>
+          <w:szCs w:val="48"/>
+          <w:lang w:val="en-US" w:eastAsia="zh-CN"/>
+        </w:rPr>
+      </w:pPr>
+      <w:r>
+        <w:rPr>
+          <w:rFonts w:hint="eastAsia"/>
+          <w:sz w:val="48"/>
+          <w:szCs w:val="48"/>
+          <w:lang w:val="en-US" w:eastAsia="zh-CN"/>
+        </w:rPr>
+        <w:t>专属邀请链接</w:t>
+      </w:r>
+    </w:p>
+    <w:p>
+      <w:pPr>
+        <w:rPr>
+          <w:rStyle w:val="15"/>
+          <w:rFonts w:hint="eastAsia"/>
+          <w:lang w:val="en-US" w:eastAsia="zh-CN"/>
+        </w:rPr>
+      </w:pPr>
+      <w:r>
+        <w:rPr>
+          <w:rStyle w:val="15"/>
+          <w:rFonts w:hint="eastAsia"/>
+          <w:lang w:val="en-US" w:eastAsia="zh-CN"/>
+        </w:rPr>
+        <w:fldChar w:fldCharType="begin"/>
+      </w:r>
+      <w:r>
+        <w:rPr>
+          <w:rStyle w:val="15"/>
+          <w:rFonts w:hint="eastAsia"/>
+          <w:lang w:val="en-US" w:eastAsia="zh-CN"/>
+        </w:rPr>
+        <w:instrText xml:space="preserve"> HYPERLINK "https://gigamoney.app.wbrks.com/session/login?app_id=winner&amp;org_id=1&amp;account_channel=hk_winner&amp;channel=kol&amp;invite-code=XD7NRTBL" </w:instrText>
+      </w:r>
+      <w:r>
+        <w:rPr>
+          <w:rStyle w:val="15"/>
+          <w:rFonts w:hint="eastAsia"/>
+          <w:lang w:val="en-US" w:eastAsia="zh-CN"/>
+        </w:rPr>
+        <w:fldChar w:fldCharType="separate"/>
+      </w:r>
+      <w:r>
+        <w:rPr>
+          <w:rStyle w:val="14"/>
+          <w:rFonts w:hint="eastAsia"/>
+          <w:lang w:val="en-US" w:eastAsia="zh-CN"/>
+        </w:rPr>
+        <w:t>https://gigamoney.app.wbrks.com/session/login?app_id=winner&amp;org_id=1&amp;account_channel=hk_winner&amp;channel=kol&amp;invite-code=XD7NRTBL</w:t>
+      </w:r>
+      <w:r>
+        <w:rPr>
+          <w:rStyle w:val="15"/>
+          <w:rFonts w:hint="eastAsia"/>
+          <w:lang w:val="en-US" w:eastAsia="zh-CN"/>
+        </w:rPr>
+        <w:fldChar w:fldCharType="end"/>
+      </w:r>
+    </w:p>
+    <w:p>
+      <w:pPr>
+        <w:rPr>
+          <w:rFonts w:hint="default"/>
+          <w:color w:val="FF0000"/>
+          <w:lang w:val="en-US" w:eastAsia="zh-CN"/>
+        </w:rPr>
+      </w:pPr>
+      <w:r>
+        <w:rPr>
+          <w:rFonts w:hint="eastAsia"/>
+          <w:color w:val="FF0000"/>
+          <w:lang w:val="en-US" w:eastAsia="zh-CN"/>
+        </w:rPr>
+        <w:t>如果注册时没填邀请码，可以在入金前绑定邀请码，这也算参与活动</w:t>
+      </w:r>
+    </w:p>
+    <w:p>
+      <w:pPr>
+        <w:rPr>
+          <w:rFonts w:hint="eastAsia"/>
+          <w:b/>
+          <w:bCs/>
+          <w:color w:val="FF0000"/>
+          <w:sz w:val="32"/>
+          <w:szCs w:val="32"/>
+          <w:lang w:val="en-US" w:eastAsia="zh-CN"/>
+        </w:rPr>
+      </w:pPr>
+      <w:r>
+        <w:rPr>
+          <w:rFonts w:hint="eastAsia"/>
+          <w:b/>
+          <w:bCs/>
+          <w:sz w:val="32"/>
+          <w:szCs w:val="32"/>
+          <w:lang w:val="en-US" w:eastAsia="zh-CN"/>
+        </w:rPr>
+        <w:t>腾达证券香港证监会持牌信息，中央编号AAB856</w:t>
+      </w:r>
+      <w:r>
+        <w:rPr>
+          <w:rFonts w:hint="eastAsia"/>
+          <w:b/>
+          <w:bCs/>
+          <w:sz w:val="32"/>
+          <w:szCs w:val="32"/>
+          <w:lang w:val="en-US" w:eastAsia="zh-CN"/>
+        </w:rPr>
+        <w:br w:type="textWrapping"/>
+      </w:r>
+      <w:r>
+        <w:rPr>
+          <w:rFonts w:hint="eastAsia"/>
+          <w:b/>
+          <w:bCs/>
+          <w:color w:val="FF0000"/>
+          <w:sz w:val="32"/>
+          <w:szCs w:val="32"/>
+          <w:lang w:val="en-US" w:eastAsia="zh-CN"/>
+        </w:rPr>
+        <w:t>可以在内地IP+内地定位的环境开户、入金、交易</w:t>
+      </w:r>
+    </w:p>
+    <w:p>
+      <w:pPr>
+        <w:rPr>
+          <w:rFonts w:hint="default"/>
+          <w:b w:val="0"/>
+          <w:bCs w:val="0"/>
+          <w:color w:val="000000" w:themeColor="text1"/>
+          <w:sz w:val="32"/>
+          <w:szCs w:val="32"/>
+          <w:lang w:val="en-US" w:eastAsia="zh-CN"/>
+          <w14:textFill>
+            <w14:solidFill>
+              <w14:schemeClr w14:val="tx1"/>
+            </w14:solidFill>
+          </w14:textFill>
+        </w:rPr>
+      </w:pPr>
+      <w:r>
+        <w:rPr>
+          <w:rFonts w:hint="eastAsia"/>
+          <w:b w:val="0"/>
+          <w:bCs w:val="0"/>
+          <w:color w:val="000000" w:themeColor="text1"/>
+          <w:sz w:val="32"/>
+          <w:szCs w:val="32"/>
+          <w:lang w:val="en-US" w:eastAsia="zh-CN"/>
+          <w14:textFill>
+            <w14:solidFill>
+              <w14:schemeClr w14:val="tx1"/>
+            </w14:solidFill>
+          </w14:textFill>
+        </w:rPr>
+        <w:t>开户奖：入金≥10,000港币，留存三天，可以得100港币邀请奖励，港美股免佣卡和40HKD股票卷</w:t>
+      </w:r>
+    </w:p>
+    <w:p>
+      <w:pPr>
+        <w:rPr>
+          <w:rFonts w:hint="eastAsia"/>
+          <w:b w:val="0"/>
+          <w:bCs w:val="0"/>
+          <w:color w:val="000000" w:themeColor="text1"/>
+          <w:sz w:val="32"/>
+          <w:szCs w:val="32"/>
+          <w:lang w:val="en-US" w:eastAsia="zh-CN"/>
+          <w14:textFill>
+            <w14:solidFill>
+              <w14:schemeClr w14:val="tx1"/>
+            </w14:solidFill>
+          </w14:textFill>
+        </w:rPr>
+      </w:pPr>
+      <w:r>
+        <w:rPr>
+          <w:rFonts w:hint="eastAsia"/>
+          <w:b w:val="0"/>
+          <w:bCs w:val="0"/>
+          <w:color w:val="000000" w:themeColor="text1"/>
+          <w:sz w:val="32"/>
+          <w:szCs w:val="32"/>
+          <w:lang w:val="en-US" w:eastAsia="zh-CN"/>
+          <w14:textFill>
+            <w14:solidFill>
+              <w14:schemeClr w14:val="tx1"/>
+            </w14:solidFill>
+          </w14:textFill>
+        </w:rPr>
+        <w:t>留存奖：留存30天，再得400港币</w:t>
+      </w:r>
+    </w:p>
+    <w:p>
+      <w:pPr>
+        <w:rPr>
+          <w:rFonts w:hint="eastAsia"/>
+          <w:b w:val="0"/>
+          <w:bCs w:val="0"/>
+          <w:color w:val="000000" w:themeColor="text1"/>
+          <w:sz w:val="32"/>
+          <w:szCs w:val="32"/>
+          <w:lang w:val="en-US" w:eastAsia="zh-CN"/>
+          <w14:textFill>
+            <w14:solidFill>
+              <w14:schemeClr w14:val="tx1"/>
+            </w14:solidFill>
+          </w14:textFill>
+        </w:rPr>
+      </w:pPr>
+      <w:r>
+        <w:rPr>
+          <w:rFonts w:hint="eastAsia"/>
+          <w:b w:val="0"/>
+          <w:bCs w:val="0"/>
+          <w:color w:val="000000" w:themeColor="text1"/>
+          <w:sz w:val="32"/>
+          <w:szCs w:val="32"/>
+          <w:lang w:val="en-US" w:eastAsia="zh-CN"/>
+          <w14:textFill>
+            <w14:solidFill>
+              <w14:schemeClr w14:val="tx1"/>
+            </w14:solidFill>
+          </w14:textFill>
+        </w:rPr>
+        <w:t>激活奖：在10月留存30天并交易6笔港美股，买卖各算一次，再得100港币，总计600港币/人</w:t>
+      </w:r>
+    </w:p>
+    <w:p>
+      <w:pPr>
+        <w:rPr>
+          <w:rFonts w:hint="eastAsia"/>
+          <w:b w:val="0"/>
+          <w:bCs w:val="0"/>
+          <w:color w:val="000000" w:themeColor="text1"/>
+          <w:sz w:val="32"/>
+          <w:szCs w:val="32"/>
+          <w:lang w:val="en-US" w:eastAsia="zh-CN"/>
+          <w14:textFill>
+            <w14:solidFill>
+              <w14:schemeClr w14:val="tx1"/>
+            </w14:solidFill>
+          </w14:textFill>
+        </w:rPr>
+      </w:pPr>
+    </w:p>
+    <w:p>
+      <w:pPr>
+        <w:rPr>
+          <w:rFonts w:hint="eastAsia"/>
+          <w:b/>
+          <w:bCs/>
+          <w:color w:val="000000" w:themeColor="text1"/>
+          <w:sz w:val="32"/>
+          <w:szCs w:val="32"/>
+          <w:lang w:val="en-US" w:eastAsia="zh-CN"/>
+          <w14:textFill>
+            <w14:solidFill>
+              <w14:schemeClr w14:val="tx1"/>
+            </w14:solidFill>
+          </w14:textFill>
+        </w:rPr>
+      </w:pPr>
+      <w:r>
+        <w:rPr>
+          <w:rFonts w:hint="eastAsia"/>
+          <w:b/>
+          <w:bCs/>
+          <w:color w:val="000000" w:themeColor="text1"/>
+          <w:sz w:val="32"/>
+          <w:szCs w:val="32"/>
+          <w:lang w:val="en-US" w:eastAsia="zh-CN"/>
+          <w14:textFill>
+            <w14:solidFill>
+              <w14:schemeClr w14:val="tx1"/>
+            </w14:solidFill>
+          </w14:textFill>
+        </w:rPr>
+        <w:t>推荐操作：</w:t>
+      </w:r>
+    </w:p>
+    <w:p>
+      <w:pPr>
+        <w:rPr>
+          <w:rFonts w:hint="default"/>
+          <w:b w:val="0"/>
+          <w:bCs w:val="0"/>
+          <w:color w:val="000000" w:themeColor="text1"/>
+          <w:sz w:val="32"/>
+          <w:szCs w:val="32"/>
+          <w:lang w:val="en-US" w:eastAsia="zh-CN"/>
+          <w14:textFill>
+            <w14:solidFill>
+              <w14:schemeClr w14:val="tx1"/>
+            </w14:solidFill>
+          </w14:textFill>
+        </w:rPr>
+      </w:pPr>
+      <w:r>
+        <w:rPr>
+          <w:rFonts w:hint="default"/>
+          <w:b w:val="0"/>
+          <w:bCs w:val="0"/>
+          <w:color w:val="000000" w:themeColor="text1"/>
+          <w:sz w:val="32"/>
+          <w:szCs w:val="32"/>
+          <w:lang w:val="en-US" w:eastAsia="zh-CN"/>
+          <w14:textFill>
+            <w14:solidFill>
+              <w14:schemeClr w14:val="tx1"/>
+            </w14:solidFill>
+          </w14:textFill>
+        </w:rPr>
+        <w:t>大家可以等入金后第二个工作日，港美股免佣卡和4张10港币的股票现金券到账了再操作，操作流程如下</w:t>
+      </w:r>
+    </w:p>
+    <w:p>
+      <w:pPr>
+        <w:rPr>
+          <w:rFonts w:hint="eastAsia"/>
+          <w:b/>
+          <w:bCs/>
+          <w:color w:val="FF0000"/>
+          <w:sz w:val="32"/>
+          <w:szCs w:val="32"/>
+          <w:lang w:val="en-US" w:eastAsia="zh-CN"/>
+        </w:rPr>
+      </w:pPr>
+      <w:r>
+        <w:rPr>
+          <w:rFonts w:hint="default"/>
+          <w:b w:val="0"/>
+          <w:bCs w:val="0"/>
+          <w:color w:val="000000" w:themeColor="text1"/>
+          <w:sz w:val="32"/>
+          <w:szCs w:val="32"/>
+          <w:lang w:val="en-US" w:eastAsia="zh-CN"/>
+          <w14:textFill>
+            <w14:solidFill>
+              <w14:schemeClr w14:val="tx1"/>
+            </w14:solidFill>
+          </w14:textFill>
+        </w:rPr>
+        <w:t>美股开市日的晚上9点半开盘时间，用市价单买入0.02股Sgov，买入5笔，然后最后一次卖出0.1股Sgov，这样交易6笔的任务也完成了，同时送的40港币的券也用了，能够到手39港币左右现金奖励，很简单就能完成</w:t>
+      </w:r>
+    </w:p>
+    <w:p>
+      <w:pPr>
+        <w:rPr>
+          <w:rFonts w:hint="eastAsia"/>
+          <w:b/>
+          <w:bCs/>
+          <w:color w:val="FF0000"/>
+          <w:sz w:val="32"/>
+          <w:szCs w:val="32"/>
+          <w:lang w:val="en-US" w:eastAsia="zh-CN"/>
+        </w:rPr>
+      </w:pPr>
+      <w:r>
+        <w:rPr>
+          <w:rFonts w:hint="eastAsia"/>
+          <w:b/>
+          <w:bCs/>
+          <w:color w:val="FF0000"/>
+          <w:sz w:val="32"/>
+          <w:szCs w:val="32"/>
+          <w:lang w:val="en-US" w:eastAsia="zh-CN"/>
+        </w:rPr>
+        <w:t>额外提醒：姓名两个字的，开户一般会触发合规，要回复邮件哈</w:t>
+      </w:r>
+    </w:p>
+    <w:p>
+      <w:pPr>
+        <w:rPr>
+          <w:rFonts w:hint="default"/>
+          <w:b/>
+          <w:bCs/>
+          <w:color w:val="FF0000"/>
+          <w:sz w:val="32"/>
+          <w:szCs w:val="32"/>
+          <w:lang w:val="en-US" w:eastAsia="zh-CN"/>
+        </w:rPr>
+      </w:pPr>
+      <w:r>
+        <w:rPr>
+          <w:rFonts w:hint="default"/>
+          <w:b/>
+          <w:bCs/>
+          <w:color w:val="FF0000"/>
+          <w:sz w:val="32"/>
+          <w:szCs w:val="32"/>
+          <w:lang w:val="en-US" w:eastAsia="zh-CN"/>
+        </w:rPr>
+        <w:t>"I categorically deny any association with any ofthese links and formally affirm that I have nohistory of criminal involvement.".</w:t>
+      </w:r>
+    </w:p>
+    <w:p>
+      <w:pPr>
+        <w:rPr>
+          <w:rFonts w:hint="default"/>
+          <w:b/>
+          <w:bCs/>
+          <w:color w:val="FF0000"/>
+          <w:sz w:val="32"/>
+          <w:szCs w:val="32"/>
+          <w:lang w:val="en-US" w:eastAsia="zh-CN"/>
+        </w:rPr>
+      </w:pPr>
+      <w:r>
+        <w:rPr>
+          <w:rFonts w:hint="default"/>
+          <w:b/>
+          <w:bCs/>
+          <w:color w:val="FF0000"/>
+          <w:sz w:val="32"/>
+          <w:szCs w:val="32"/>
+          <w:lang w:val="en-US" w:eastAsia="zh-CN"/>
+        </w:rPr>
+        <w:t>一般回复这个英文就可以了</w:t>
+      </w:r>
+    </w:p>
+    <w:p>
+      <w:pPr>
+        <w:rPr>
+          <w:rFonts w:hint="default"/>
+          <w:b/>
+          <w:bCs/>
+          <w:color w:val="FF0000"/>
+          <w:sz w:val="32"/>
+          <w:szCs w:val="32"/>
+          <w:lang w:val="en-US" w:eastAsia="zh-CN"/>
+        </w:rPr>
+      </w:pPr>
+    </w:p>
+    <w:p>
+      <w:pPr>
+        <w:rPr>
+          <w:rFonts w:hint="default"/>
+          <w:b/>
+          <w:bCs/>
+          <w:color w:val="FF0000"/>
+          <w:sz w:val="32"/>
+          <w:szCs w:val="32"/>
+          <w:lang w:val="en-US" w:eastAsia="zh-CN"/>
+        </w:rPr>
+        <w:sectPr>
+          <w:pgSz w:w="11906" w:h="16838"/>
+          <w:pgMar w:top="1440" w:right="1800" w:bottom="1440" w:left="1800" w:header="851" w:footer="992" w:gutter="0"/>
+          <w:cols w:space="425" w:num="1"/>
+          <w:docGrid w:type="lines" w:linePitch="312" w:charSpace="0"/>
+        </w:sectPr>
+      </w:pPr>
+      <w:r>
+        <w:rPr>
+          <w:rFonts w:hint="default"/>
+          <w:b/>
+          <w:bCs/>
+          <w:color w:val="FF0000"/>
+          <w:sz w:val="32"/>
+          <w:szCs w:val="32"/>
+          <w:lang w:val="en-US" w:eastAsia="zh-CN"/>
+        </w:rPr>
+        <w:drawing>
+          <wp:inline distT="0" distB="0" distL="114300" distR="114300">
+            <wp:extent cx="5271135" cy="3947160"/>
+            <wp:effectExtent l="0" t="0" r="12065" b="2540"/>
+            <wp:docPr id="6" name="图片 6" descr="手续费对比"/>
+            <wp:cNvGraphicFramePr>
+              <a:graphicFrameLocks xmlns:a="http://schemas.openxmlformats.org/drawingml/2006/main" noChangeAspect="1"/>
+            </wp:cNvGraphicFramePr>
+            <a:graphic xmlns:a="http://schemas.openxmlformats.org/drawingml/2006/main">
+              <a:graphicData uri="http://schemas.openxmlformats.org/drawingml/2006/picture">
+                <pic:pic xmlns:pic="http://schemas.openxmlformats.org/drawingml/2006/picture">
+                  <pic:nvPicPr>
+                    <pic:cNvPr id="6" name="图片 6" descr="手续费对比"/>
+                    <pic:cNvPicPr>
+                      <a:picLocks noChangeAspect="1"/>
+                    </pic:cNvPicPr>
+                  </pic:nvPicPr>
+                  <pic:blipFill>
+                    <a:blip r:embed="rId9"/>
+                    <a:stretch>
+                      <a:fillRect/>
+                    </a:stretch>
+                  </pic:blipFill>
+                  <pic:spPr>
+                    <a:xfrm>
+                      <a:off x="0" y="0"/>
+                      <a:ext cx="5271135" cy="3947160"/>
+                    </a:xfrm>
+                    <a:prstGeom prst="rect">
+                      <a:avLst/>
+                    </a:prstGeom>
+                  </pic:spPr>
+                </pic:pic>
+              </a:graphicData>
+            </a:graphic>
+          </wp:inline>
+        </w:drawing>
+      </w:r>
+      <w:r>
+        <w:rPr>
+          <w:rFonts w:hint="default"/>
+          <w:b/>
+          <w:bCs/>
+          <w:color w:val="FF0000"/>
+          <w:sz w:val="32"/>
+          <w:szCs w:val="32"/>
+          <w:lang w:val="en-US" w:eastAsia="zh-CN"/>
+        </w:rPr>
+        <w:br w:type="textWrapping"/>
+      </w:r>
+    </w:p>
+    <w:p>
+      <w:pPr>
+        <w:pStyle w:val="2"/>
+        <w:bidi w:val="0"/>
+        <w:rPr>
+          <w:rFonts w:hint="eastAsia"/>
+          <w:lang w:val="en-US" w:eastAsia="zh-CN"/>
+        </w:rPr>
+      </w:pPr>
+      <w:bookmarkStart w:id="15" w:name="_Toc9694"/>
+      <w:r>
+        <w:rPr>
+          <w:rFonts w:hint="eastAsia"/>
+          <w:lang w:val="en-US" w:eastAsia="zh-CN"/>
+        </w:rPr>
+        <w:t>我的联系方式</w:t>
+      </w:r>
+      <w:bookmarkEnd w:id="15"/>
+      <w:r>
+        <w:rPr>
+          <w:rFonts w:hint="eastAsia"/>
+          <w:lang w:val="en-US" w:eastAsia="zh-CN"/>
+        </w:rPr>
+        <w:t xml:space="preserve"> </w:t>
+      </w:r>
+    </w:p>
+    <w:p>
+      <w:pPr>
+        <w:rPr>
+          <w:rFonts w:hint="default"/>
+          <w:sz w:val="48"/>
+          <w:szCs w:val="48"/>
+          <w:lang w:val="en-US" w:eastAsia="zh-CN"/>
+        </w:rPr>
+      </w:pPr>
+      <w:r>
+        <w:rPr>
+          <w:rFonts w:hint="eastAsia"/>
+          <w:sz w:val="48"/>
+          <w:szCs w:val="48"/>
+          <w:lang w:val="en-US" w:eastAsia="zh-CN"/>
+        </w:rPr>
+        <w:t>全平台同号~</w:t>
+      </w:r>
+    </w:p>
+    <w:p>
+      <w:pPr>
+        <w:rPr>
+          <w:rFonts w:hint="eastAsia"/>
           <w:sz w:val="48"/>
           <w:szCs w:val="48"/>
           <w:lang w:val="en-US" w:eastAsia="zh-CN"/>
@@ -4387,6 +5721,25 @@
     <w:p>
       <w:pPr>
         <w:rPr>
+          <w:rFonts w:hint="default"/>
+          <w:sz w:val="48"/>
+          <w:szCs w:val="48"/>
+          <w:lang w:val="en-US" w:eastAsia="zh-CN"/>
+        </w:rPr>
+      </w:pPr>
+      <w:r>
+        <w:rPr>
+          <w:rFonts w:hint="eastAsia"/>
+          <w:sz w:val="48"/>
+          <w:szCs w:val="48"/>
+          <w:lang w:val="en-US" w:eastAsia="zh-CN"/>
+        </w:rPr>
+        <w:t>小红书：Kirinchew</w:t>
+      </w:r>
+    </w:p>
+    <w:p>
+      <w:pPr>
+        <w:rPr>
           <w:rFonts w:hint="eastAsia"/>
           <w:sz w:val="48"/>
           <w:szCs w:val="48"/>
@@ -4441,7 +5794,7 @@
       </w:r>
       <w:r>
         <w:rPr>
-          <w:rStyle w:val="11"/>
+          <w:rStyle w:val="15"/>
           <w:rFonts w:hint="eastAsia"/>
           <w:sz w:val="48"/>
           <w:szCs w:val="48"/>
@@ -4495,7 +5848,7 @@
           <w:szCs w:val="24"/>
           <w:lang w:val="en-US" w:eastAsia="zh-CN"/>
         </w:rPr>
-        <w:t>需要香港电话卡接短信/用流量的也可以联系我（CSL和hahasim）保号低至20HKD/year</w:t>
+        <w:t>需要香港电话卡接短信/用流量的也可以联系我（CSL和hahasim）保号低至6HKD/year</w:t>
       </w:r>
     </w:p>
     <w:p>
@@ -4578,38 +5931,6 @@
           <w:lang w:val="en-US" w:eastAsia="zh-CN"/>
         </w:rPr>
       </w:pPr>
-    </w:p>
-    <w:p>
-      <w:pPr>
-        <w:rPr>
-          <w:rFonts w:hint="eastAsia"/>
-          <w:sz w:val="30"/>
-          <w:szCs w:val="30"/>
-          <w:lang w:val="en-US" w:eastAsia="zh-CN"/>
-        </w:rPr>
-      </w:pPr>
-    </w:p>
-    <w:p>
-      <w:pPr>
-        <w:rPr>
-          <w:rFonts w:hint="eastAsia"/>
-          <w:sz w:val="30"/>
-          <w:szCs w:val="30"/>
-          <w:lang w:val="en-US" w:eastAsia="zh-CN"/>
-        </w:rPr>
-      </w:pPr>
-    </w:p>
-    <w:p>
-      <w:pPr>
-        <w:rPr>
-          <w:rFonts w:hint="eastAsia"/>
-          <w:sz w:val="30"/>
-          <w:szCs w:val="30"/>
-          <w:lang w:val="en-US" w:eastAsia="zh-CN"/>
-        </w:rPr>
-      </w:pPr>
-      <w:bookmarkStart w:id="0" w:name="_GoBack"/>
-      <w:bookmarkEnd w:id="0"/>
     </w:p>
     <w:p>
       <w:pPr>
@@ -4920,6 +6241,7 @@
     <w:name w:val="heading 1"/>
     <w:basedOn w:val="1"/>
     <w:next w:val="1"/>
+    <w:link w:val="17"/>
     <w:qFormat/>
     <w:uiPriority w:val="0"/>
     <w:pPr>
@@ -4938,6 +6260,7 @@
     <w:name w:val="heading 2"/>
     <w:basedOn w:val="1"/>
     <w:next w:val="1"/>
+    <w:link w:val="16"/>
     <w:unhideWhenUsed/>
     <w:qFormat/>
     <w:uiPriority w:val="0"/>
@@ -5008,13 +6331,13 @@
       <w:sz w:val="28"/>
     </w:rPr>
   </w:style>
-  <w:style w:type="character" w:default="1" w:styleId="9">
+  <w:style w:type="character" w:default="1" w:styleId="13">
     <w:name w:val="Default Paragraph Font"/>
     <w:semiHidden/>
     <w:qFormat/>
     <w:uiPriority w:val="0"/>
   </w:style>
-  <w:style w:type="table" w:default="1" w:styleId="8">
+  <w:style w:type="table" w:default="1" w:styleId="12">
     <w:name w:val="Normal Table"/>
     <w:semiHidden/>
     <w:qFormat/>
@@ -5029,6 +6352,40 @@
     </w:tblPr>
   </w:style>
   <w:style w:type="paragraph" w:styleId="7">
+    <w:name w:val="toc 5"/>
+    <w:basedOn w:val="1"/>
+    <w:next w:val="1"/>
+    <w:link w:val="18"/>
+    <w:uiPriority w:val="0"/>
+    <w:pPr>
+      <w:ind w:left="1680" w:leftChars="800"/>
+    </w:pPr>
+  </w:style>
+  <w:style w:type="paragraph" w:styleId="8">
+    <w:name w:val="toc 3"/>
+    <w:basedOn w:val="1"/>
+    <w:next w:val="1"/>
+    <w:uiPriority w:val="0"/>
+    <w:pPr>
+      <w:ind w:left="840" w:leftChars="400"/>
+    </w:pPr>
+  </w:style>
+  <w:style w:type="paragraph" w:styleId="9">
+    <w:name w:val="toc 1"/>
+    <w:basedOn w:val="1"/>
+    <w:next w:val="1"/>
+    <w:uiPriority w:val="0"/>
+  </w:style>
+  <w:style w:type="paragraph" w:styleId="10">
+    <w:name w:val="toc 4"/>
+    <w:basedOn w:val="1"/>
+    <w:next w:val="1"/>
+    <w:uiPriority w:val="0"/>
+    <w:pPr>
+      <w:ind w:left="1260" w:leftChars="600"/>
+    </w:pPr>
+  </w:style>
+  <w:style w:type="paragraph" w:styleId="11">
     <w:name w:val="Normal (Web)"/>
     <w:basedOn w:val="1"/>
     <w:qFormat/>
@@ -5044,9 +6401,9 @@
       <w:lang w:val="en-US" w:eastAsia="zh-CN" w:bidi="ar"/>
     </w:rPr>
   </w:style>
-  <w:style w:type="character" w:styleId="10">
+  <w:style w:type="character" w:styleId="14">
     <w:name w:val="FollowedHyperlink"/>
-    <w:basedOn w:val="9"/>
+    <w:basedOn w:val="13"/>
     <w:qFormat/>
     <w:uiPriority w:val="0"/>
     <w:rPr>
@@ -5054,14 +6411,76 @@
       <w:u w:val="single"/>
     </w:rPr>
   </w:style>
-  <w:style w:type="character" w:styleId="11">
+  <w:style w:type="character" w:styleId="15">
     <w:name w:val="Hyperlink"/>
-    <w:basedOn w:val="9"/>
+    <w:basedOn w:val="13"/>
     <w:qFormat/>
     <w:uiPriority w:val="0"/>
     <w:rPr>
+      <w:rFonts w:asciiTheme="minorHAnsi" w:hAnsiTheme="minorHAnsi" w:eastAsiaTheme="minorEastAsia" w:cstheme="minorBidi"/>
       <w:color w:val="0000FF"/>
+      <w:sz w:val="24"/>
+      <w:szCs w:val="24"/>
       <w:u w:val="single"/>
+      <w:lang w:val="en-US" w:eastAsia="zh-CN" w:bidi="ar"/>
+    </w:rPr>
+  </w:style>
+  <w:style w:type="character" w:customStyle="1" w:styleId="16">
+    <w:name w:val="标题 2 Char"/>
+    <w:link w:val="3"/>
+    <w:uiPriority w:val="0"/>
+    <w:rPr>
+      <w:rFonts w:ascii="Arial" w:hAnsi="Arial" w:eastAsia="黑体"/>
+      <w:b/>
+      <w:sz w:val="32"/>
+    </w:rPr>
+  </w:style>
+  <w:style w:type="character" w:customStyle="1" w:styleId="17">
+    <w:name w:val="标题 1 Char"/>
+    <w:link w:val="2"/>
+    <w:uiPriority w:val="0"/>
+    <w:rPr>
+      <w:b/>
+      <w:kern w:val="44"/>
+      <w:sz w:val="44"/>
+    </w:rPr>
+  </w:style>
+  <w:style w:type="character" w:customStyle="1" w:styleId="18">
+    <w:name w:val="目录 5 Char"/>
+    <w:link w:val="7"/>
+    <w:uiPriority w:val="0"/>
+  </w:style>
+  <w:style w:type="paragraph" w:customStyle="1" w:styleId="19">
+    <w:name w:val="WPSOffice手动目录 1"/>
+    <w:uiPriority w:val="0"/>
+    <w:pPr>
+      <w:ind w:leftChars="0"/>
+    </w:pPr>
+    <w:rPr>
+      <w:sz w:val="20"/>
+      <w:szCs w:val="20"/>
+    </w:rPr>
+  </w:style>
+  <w:style w:type="paragraph" w:customStyle="1" w:styleId="20">
+    <w:name w:val="WPSOffice手动目录 2"/>
+    <w:uiPriority w:val="0"/>
+    <w:pPr>
+      <w:ind w:leftChars="200"/>
+    </w:pPr>
+    <w:rPr>
+      <w:sz w:val="20"/>
+      <w:szCs w:val="20"/>
+    </w:rPr>
+  </w:style>
+  <w:style w:type="paragraph" w:customStyle="1" w:styleId="21">
+    <w:name w:val="WPSOffice手动目录 3"/>
+    <w:uiPriority w:val="0"/>
+    <w:pPr>
+      <w:ind w:leftChars="400"/>
+    </w:pPr>
+    <w:rPr>
+      <w:sz w:val="20"/>
+      <w:szCs w:val="20"/>
     </w:rPr>
   </w:style>
 </w:styles>

</xml_diff>